<commit_message>
Mise à jour de la doc
</commit_message>
<xml_diff>
--- a/Doc/Doc.docx
+++ b/Doc/Doc.docx
@@ -5,8 +5,1100 @@
     <w:p>
       <w:pPr>
         <w:pStyle w:val="Titre"/>
-      </w:pPr>
-      <w:r>
+        <w:jc w:val="center"/>
+        <w:rPr>
+          <w:sz w:val="96"/>
+          <w:szCs w:val="96"/>
+        </w:rPr>
+      </w:pPr>
+    </w:p>
+    <w:p>
+      <w:pPr>
+        <w:pStyle w:val="Titre"/>
+        <w:jc w:val="center"/>
+        <w:rPr>
+          <w:sz w:val="96"/>
+          <w:szCs w:val="96"/>
+        </w:rPr>
+      </w:pPr>
+    </w:p>
+    <w:p>
+      <w:pPr>
+        <w:pStyle w:val="Titre"/>
+        <w:jc w:val="center"/>
+        <w:rPr>
+          <w:sz w:val="96"/>
+          <w:szCs w:val="96"/>
+        </w:rPr>
+      </w:pPr>
+      <w:r>
+        <w:rPr>
+          <w:sz w:val="96"/>
+          <w:szCs w:val="96"/>
+        </w:rPr>
+        <w:t>MA-Métier :</w:t>
+      </w:r>
+      <w:r>
+        <w:rPr>
+          <w:sz w:val="96"/>
+          <w:szCs w:val="96"/>
+        </w:rPr>
+        <w:t xml:space="preserve"> </w:t>
+      </w:r>
+      <w:proofErr w:type="spellStart"/>
+      <w:r>
+        <w:rPr>
+          <w:sz w:val="96"/>
+          <w:szCs w:val="96"/>
+        </w:rPr>
+        <w:t>Autopilot</w:t>
+      </w:r>
+      <w:proofErr w:type="spellEnd"/>
+    </w:p>
+    <w:p/>
+    <w:p>
+      <w:pPr>
+        <w:jc w:val="center"/>
+        <w:rPr>
+          <w:sz w:val="56"/>
+          <w:szCs w:val="56"/>
+        </w:rPr>
+      </w:pPr>
+      <w:r>
+        <w:rPr>
+          <w:sz w:val="56"/>
+          <w:szCs w:val="56"/>
+        </w:rPr>
+        <w:t>Documentation</w:t>
+      </w:r>
+    </w:p>
+    <w:p/>
+    <w:p>
+      <w:r>
+        <w:br w:type="page"/>
+      </w:r>
+    </w:p>
+    <w:sdt>
+      <w:sdtPr>
+        <w:rPr>
+          <w:lang w:val="fr-FR"/>
+        </w:rPr>
+        <w:id w:val="-619916753"/>
+        <w:docPartObj>
+          <w:docPartGallery w:val="Table of Contents"/>
+          <w:docPartUnique/>
+        </w:docPartObj>
+      </w:sdtPr>
+      <w:sdtEndPr>
+        <w:rPr>
+          <w:rFonts w:asciiTheme="minorHAnsi" w:eastAsiaTheme="minorHAnsi" w:hAnsiTheme="minorHAnsi" w:cstheme="minorBidi"/>
+          <w:b/>
+          <w:bCs/>
+          <w:color w:val="auto"/>
+          <w:kern w:val="2"/>
+          <w:sz w:val="24"/>
+          <w:szCs w:val="24"/>
+          <w:lang w:eastAsia="en-US"/>
+          <w14:ligatures w14:val="standardContextual"/>
+        </w:rPr>
+      </w:sdtEndPr>
+      <w:sdtContent>
+        <w:p>
+          <w:pPr>
+            <w:pStyle w:val="En-ttedetabledesmatires"/>
+          </w:pPr>
+          <w:r>
+            <w:rPr>
+              <w:lang w:val="fr-FR"/>
+            </w:rPr>
+            <w:t>Table des matières</w:t>
+          </w:r>
+        </w:p>
+        <w:p>
+          <w:pPr>
+            <w:pStyle w:val="TM1"/>
+            <w:tabs>
+              <w:tab w:val="right" w:leader="dot" w:pos="9062"/>
+            </w:tabs>
+            <w:rPr>
+              <w:noProof/>
+            </w:rPr>
+          </w:pPr>
+          <w:r>
+            <w:fldChar w:fldCharType="begin"/>
+          </w:r>
+          <w:r>
+            <w:instrText xml:space="preserve"> TOC \o "1-3" \h \z \u </w:instrText>
+          </w:r>
+          <w:r>
+            <w:fldChar w:fldCharType="separate"/>
+          </w:r>
+          <w:hyperlink w:anchor="_Toc220499868" w:history="1">
+            <w:r>
+              <w:rPr>
+                <w:rStyle w:val="Lienhypertexte"/>
+                <w:noProof/>
+              </w:rPr>
+              <w:t>Logique de base du vol plat :</w:t>
+            </w:r>
+            <w:r>
+              <w:rPr>
+                <w:noProof/>
+                <w:webHidden/>
+              </w:rPr>
+              <w:tab/>
+            </w:r>
+            <w:r>
+              <w:rPr>
+                <w:noProof/>
+                <w:webHidden/>
+              </w:rPr>
+              <w:fldChar w:fldCharType="begin"/>
+            </w:r>
+            <w:r>
+              <w:rPr>
+                <w:noProof/>
+                <w:webHidden/>
+              </w:rPr>
+              <w:instrText xml:space="preserve"> PAGEREF _Toc220499868 \h </w:instrText>
+            </w:r>
+            <w:r>
+              <w:rPr>
+                <w:noProof/>
+                <w:webHidden/>
+              </w:rPr>
+            </w:r>
+            <w:r>
+              <w:rPr>
+                <w:noProof/>
+                <w:webHidden/>
+              </w:rPr>
+              <w:fldChar w:fldCharType="separate"/>
+            </w:r>
+            <w:r>
+              <w:rPr>
+                <w:noProof/>
+                <w:webHidden/>
+              </w:rPr>
+              <w:t>3</w:t>
+            </w:r>
+            <w:r>
+              <w:rPr>
+                <w:noProof/>
+                <w:webHidden/>
+              </w:rPr>
+              <w:fldChar w:fldCharType="end"/>
+            </w:r>
+          </w:hyperlink>
+        </w:p>
+        <w:p>
+          <w:pPr>
+            <w:pStyle w:val="TM2"/>
+            <w:tabs>
+              <w:tab w:val="right" w:leader="dot" w:pos="9062"/>
+            </w:tabs>
+            <w:rPr>
+              <w:noProof/>
+            </w:rPr>
+          </w:pPr>
+          <w:hyperlink w:anchor="_Toc220499869" w:history="1">
+            <w:r>
+              <w:rPr>
+                <w:rStyle w:val="Lienhypertexte"/>
+                <w:noProof/>
+              </w:rPr>
+              <w:t>Valeur à récupérer (Get)</w:t>
+            </w:r>
+            <w:r>
+              <w:rPr>
+                <w:noProof/>
+                <w:webHidden/>
+              </w:rPr>
+              <w:tab/>
+            </w:r>
+            <w:r>
+              <w:rPr>
+                <w:noProof/>
+                <w:webHidden/>
+              </w:rPr>
+              <w:fldChar w:fldCharType="begin"/>
+            </w:r>
+            <w:r>
+              <w:rPr>
+                <w:noProof/>
+                <w:webHidden/>
+              </w:rPr>
+              <w:instrText xml:space="preserve"> PAGEREF _Toc220499869 \h </w:instrText>
+            </w:r>
+            <w:r>
+              <w:rPr>
+                <w:noProof/>
+                <w:webHidden/>
+              </w:rPr>
+            </w:r>
+            <w:r>
+              <w:rPr>
+                <w:noProof/>
+                <w:webHidden/>
+              </w:rPr>
+              <w:fldChar w:fldCharType="separate"/>
+            </w:r>
+            <w:r>
+              <w:rPr>
+                <w:noProof/>
+                <w:webHidden/>
+              </w:rPr>
+              <w:t>3</w:t>
+            </w:r>
+            <w:r>
+              <w:rPr>
+                <w:noProof/>
+                <w:webHidden/>
+              </w:rPr>
+              <w:fldChar w:fldCharType="end"/>
+            </w:r>
+          </w:hyperlink>
+        </w:p>
+        <w:p>
+          <w:pPr>
+            <w:pStyle w:val="TM2"/>
+            <w:tabs>
+              <w:tab w:val="right" w:leader="dot" w:pos="9062"/>
+            </w:tabs>
+            <w:rPr>
+              <w:noProof/>
+            </w:rPr>
+          </w:pPr>
+          <w:hyperlink w:anchor="_Toc220499870" w:history="1">
+            <w:r>
+              <w:rPr>
+                <w:rStyle w:val="Lienhypertexte"/>
+                <w:noProof/>
+              </w:rPr>
+              <w:t>Valeur à définir (Set)</w:t>
+            </w:r>
+            <w:r>
+              <w:rPr>
+                <w:noProof/>
+                <w:webHidden/>
+              </w:rPr>
+              <w:tab/>
+            </w:r>
+            <w:r>
+              <w:rPr>
+                <w:noProof/>
+                <w:webHidden/>
+              </w:rPr>
+              <w:fldChar w:fldCharType="begin"/>
+            </w:r>
+            <w:r>
+              <w:rPr>
+                <w:noProof/>
+                <w:webHidden/>
+              </w:rPr>
+              <w:instrText xml:space="preserve"> PAGEREF _Toc220499870 \h </w:instrText>
+            </w:r>
+            <w:r>
+              <w:rPr>
+                <w:noProof/>
+                <w:webHidden/>
+              </w:rPr>
+            </w:r>
+            <w:r>
+              <w:rPr>
+                <w:noProof/>
+                <w:webHidden/>
+              </w:rPr>
+              <w:fldChar w:fldCharType="separate"/>
+            </w:r>
+            <w:r>
+              <w:rPr>
+                <w:noProof/>
+                <w:webHidden/>
+              </w:rPr>
+              <w:t>3</w:t>
+            </w:r>
+            <w:r>
+              <w:rPr>
+                <w:noProof/>
+                <w:webHidden/>
+              </w:rPr>
+              <w:fldChar w:fldCharType="end"/>
+            </w:r>
+          </w:hyperlink>
+        </w:p>
+        <w:p>
+          <w:pPr>
+            <w:pStyle w:val="TM2"/>
+            <w:tabs>
+              <w:tab w:val="right" w:leader="dot" w:pos="9062"/>
+            </w:tabs>
+            <w:rPr>
+              <w:noProof/>
+            </w:rPr>
+          </w:pPr>
+          <w:hyperlink w:anchor="_Toc220499871" w:history="1">
+            <w:r>
+              <w:rPr>
+                <w:rStyle w:val="Lienhypertexte"/>
+                <w:noProof/>
+              </w:rPr>
+              <w:t>Plat Roulis</w:t>
+            </w:r>
+            <w:r>
+              <w:rPr>
+                <w:noProof/>
+                <w:webHidden/>
+              </w:rPr>
+              <w:tab/>
+            </w:r>
+            <w:r>
+              <w:rPr>
+                <w:noProof/>
+                <w:webHidden/>
+              </w:rPr>
+              <w:fldChar w:fldCharType="begin"/>
+            </w:r>
+            <w:r>
+              <w:rPr>
+                <w:noProof/>
+                <w:webHidden/>
+              </w:rPr>
+              <w:instrText xml:space="preserve"> PAGEREF _Toc220499871 \h </w:instrText>
+            </w:r>
+            <w:r>
+              <w:rPr>
+                <w:noProof/>
+                <w:webHidden/>
+              </w:rPr>
+            </w:r>
+            <w:r>
+              <w:rPr>
+                <w:noProof/>
+                <w:webHidden/>
+              </w:rPr>
+              <w:fldChar w:fldCharType="separate"/>
+            </w:r>
+            <w:r>
+              <w:rPr>
+                <w:noProof/>
+                <w:webHidden/>
+              </w:rPr>
+              <w:t>4</w:t>
+            </w:r>
+            <w:r>
+              <w:rPr>
+                <w:noProof/>
+                <w:webHidden/>
+              </w:rPr>
+              <w:fldChar w:fldCharType="end"/>
+            </w:r>
+          </w:hyperlink>
+        </w:p>
+        <w:p>
+          <w:pPr>
+            <w:pStyle w:val="TM2"/>
+            <w:tabs>
+              <w:tab w:val="right" w:leader="dot" w:pos="9062"/>
+            </w:tabs>
+            <w:rPr>
+              <w:noProof/>
+            </w:rPr>
+          </w:pPr>
+          <w:hyperlink w:anchor="_Toc220499872" w:history="1">
+            <w:r>
+              <w:rPr>
+                <w:rStyle w:val="Lienhypertexte"/>
+                <w:noProof/>
+              </w:rPr>
+              <w:t>Plat Tangage et Vitesse N=vitesse demandée</w:t>
+            </w:r>
+            <w:r>
+              <w:rPr>
+                <w:noProof/>
+                <w:webHidden/>
+              </w:rPr>
+              <w:tab/>
+            </w:r>
+            <w:r>
+              <w:rPr>
+                <w:noProof/>
+                <w:webHidden/>
+              </w:rPr>
+              <w:fldChar w:fldCharType="begin"/>
+            </w:r>
+            <w:r>
+              <w:rPr>
+                <w:noProof/>
+                <w:webHidden/>
+              </w:rPr>
+              <w:instrText xml:space="preserve"> PAGEREF _Toc220499872 \h </w:instrText>
+            </w:r>
+            <w:r>
+              <w:rPr>
+                <w:noProof/>
+                <w:webHidden/>
+              </w:rPr>
+            </w:r>
+            <w:r>
+              <w:rPr>
+                <w:noProof/>
+                <w:webHidden/>
+              </w:rPr>
+              <w:fldChar w:fldCharType="separate"/>
+            </w:r>
+            <w:r>
+              <w:rPr>
+                <w:noProof/>
+                <w:webHidden/>
+              </w:rPr>
+              <w:t>4</w:t>
+            </w:r>
+            <w:r>
+              <w:rPr>
+                <w:noProof/>
+                <w:webHidden/>
+              </w:rPr>
+              <w:fldChar w:fldCharType="end"/>
+            </w:r>
+          </w:hyperlink>
+        </w:p>
+        <w:p>
+          <w:pPr>
+            <w:pStyle w:val="TM2"/>
+            <w:tabs>
+              <w:tab w:val="right" w:leader="dot" w:pos="9062"/>
+            </w:tabs>
+            <w:rPr>
+              <w:noProof/>
+            </w:rPr>
+          </w:pPr>
+          <w:hyperlink w:anchor="_Toc220499873" w:history="1">
+            <w:r>
+              <w:rPr>
+                <w:rStyle w:val="Lienhypertexte"/>
+                <w:noProof/>
+              </w:rPr>
+              <w:t>Direction N=angle départ</w:t>
+            </w:r>
+            <w:r>
+              <w:rPr>
+                <w:noProof/>
+                <w:webHidden/>
+              </w:rPr>
+              <w:tab/>
+            </w:r>
+            <w:r>
+              <w:rPr>
+                <w:noProof/>
+                <w:webHidden/>
+              </w:rPr>
+              <w:fldChar w:fldCharType="begin"/>
+            </w:r>
+            <w:r>
+              <w:rPr>
+                <w:noProof/>
+                <w:webHidden/>
+              </w:rPr>
+              <w:instrText xml:space="preserve"> PAGEREF _Toc220499873 \h </w:instrText>
+            </w:r>
+            <w:r>
+              <w:rPr>
+                <w:noProof/>
+                <w:webHidden/>
+              </w:rPr>
+            </w:r>
+            <w:r>
+              <w:rPr>
+                <w:noProof/>
+                <w:webHidden/>
+              </w:rPr>
+              <w:fldChar w:fldCharType="separate"/>
+            </w:r>
+            <w:r>
+              <w:rPr>
+                <w:noProof/>
+                <w:webHidden/>
+              </w:rPr>
+              <w:t>4</w:t>
+            </w:r>
+            <w:r>
+              <w:rPr>
+                <w:noProof/>
+                <w:webHidden/>
+              </w:rPr>
+              <w:fldChar w:fldCharType="end"/>
+            </w:r>
+          </w:hyperlink>
+        </w:p>
+        <w:p>
+          <w:pPr>
+            <w:pStyle w:val="TM2"/>
+            <w:tabs>
+              <w:tab w:val="right" w:leader="dot" w:pos="9062"/>
+            </w:tabs>
+            <w:rPr>
+              <w:noProof/>
+            </w:rPr>
+          </w:pPr>
+          <w:hyperlink w:anchor="_Toc220499874" w:history="1">
+            <w:r>
+              <w:rPr>
+                <w:rStyle w:val="Lienhypertexte"/>
+                <w:noProof/>
+              </w:rPr>
+              <w:t>Problèmes</w:t>
+            </w:r>
+            <w:r>
+              <w:rPr>
+                <w:noProof/>
+                <w:webHidden/>
+              </w:rPr>
+              <w:tab/>
+            </w:r>
+            <w:r>
+              <w:rPr>
+                <w:noProof/>
+                <w:webHidden/>
+              </w:rPr>
+              <w:fldChar w:fldCharType="begin"/>
+            </w:r>
+            <w:r>
+              <w:rPr>
+                <w:noProof/>
+                <w:webHidden/>
+              </w:rPr>
+              <w:instrText xml:space="preserve"> PAGEREF _Toc220499874 \h </w:instrText>
+            </w:r>
+            <w:r>
+              <w:rPr>
+                <w:noProof/>
+                <w:webHidden/>
+              </w:rPr>
+            </w:r>
+            <w:r>
+              <w:rPr>
+                <w:noProof/>
+                <w:webHidden/>
+              </w:rPr>
+              <w:fldChar w:fldCharType="separate"/>
+            </w:r>
+            <w:r>
+              <w:rPr>
+                <w:noProof/>
+                <w:webHidden/>
+              </w:rPr>
+              <w:t>5</w:t>
+            </w:r>
+            <w:r>
+              <w:rPr>
+                <w:noProof/>
+                <w:webHidden/>
+              </w:rPr>
+              <w:fldChar w:fldCharType="end"/>
+            </w:r>
+          </w:hyperlink>
+        </w:p>
+        <w:p>
+          <w:pPr>
+            <w:pStyle w:val="TM3"/>
+            <w:tabs>
+              <w:tab w:val="right" w:leader="dot" w:pos="9062"/>
+            </w:tabs>
+            <w:rPr>
+              <w:noProof/>
+            </w:rPr>
+          </w:pPr>
+          <w:hyperlink w:anchor="_Toc220499875" w:history="1">
+            <w:r>
+              <w:rPr>
+                <w:rStyle w:val="Lienhypertexte"/>
+                <w:noProof/>
+              </w:rPr>
+              <w:t>Problème 1 :</w:t>
+            </w:r>
+            <w:r>
+              <w:rPr>
+                <w:noProof/>
+                <w:webHidden/>
+              </w:rPr>
+              <w:tab/>
+            </w:r>
+            <w:r>
+              <w:rPr>
+                <w:noProof/>
+                <w:webHidden/>
+              </w:rPr>
+              <w:fldChar w:fldCharType="begin"/>
+            </w:r>
+            <w:r>
+              <w:rPr>
+                <w:noProof/>
+                <w:webHidden/>
+              </w:rPr>
+              <w:instrText xml:space="preserve"> PAGEREF _Toc220499875 \h </w:instrText>
+            </w:r>
+            <w:r>
+              <w:rPr>
+                <w:noProof/>
+                <w:webHidden/>
+              </w:rPr>
+            </w:r>
+            <w:r>
+              <w:rPr>
+                <w:noProof/>
+                <w:webHidden/>
+              </w:rPr>
+              <w:fldChar w:fldCharType="separate"/>
+            </w:r>
+            <w:r>
+              <w:rPr>
+                <w:noProof/>
+                <w:webHidden/>
+              </w:rPr>
+              <w:t>5</w:t>
+            </w:r>
+            <w:r>
+              <w:rPr>
+                <w:noProof/>
+                <w:webHidden/>
+              </w:rPr>
+              <w:fldChar w:fldCharType="end"/>
+            </w:r>
+          </w:hyperlink>
+        </w:p>
+        <w:p>
+          <w:pPr>
+            <w:pStyle w:val="TM3"/>
+            <w:tabs>
+              <w:tab w:val="right" w:leader="dot" w:pos="9062"/>
+            </w:tabs>
+            <w:rPr>
+              <w:noProof/>
+            </w:rPr>
+          </w:pPr>
+          <w:hyperlink w:anchor="_Toc220499876" w:history="1">
+            <w:r>
+              <w:rPr>
+                <w:rStyle w:val="Lienhypertexte"/>
+                <w:noProof/>
+              </w:rPr>
+              <w:t>Problème 2 :</w:t>
+            </w:r>
+            <w:r>
+              <w:rPr>
+                <w:noProof/>
+                <w:webHidden/>
+              </w:rPr>
+              <w:tab/>
+            </w:r>
+            <w:r>
+              <w:rPr>
+                <w:noProof/>
+                <w:webHidden/>
+              </w:rPr>
+              <w:fldChar w:fldCharType="begin"/>
+            </w:r>
+            <w:r>
+              <w:rPr>
+                <w:noProof/>
+                <w:webHidden/>
+              </w:rPr>
+              <w:instrText xml:space="preserve"> PAGEREF _Toc220499876 \h </w:instrText>
+            </w:r>
+            <w:r>
+              <w:rPr>
+                <w:noProof/>
+                <w:webHidden/>
+              </w:rPr>
+            </w:r>
+            <w:r>
+              <w:rPr>
+                <w:noProof/>
+                <w:webHidden/>
+              </w:rPr>
+              <w:fldChar w:fldCharType="separate"/>
+            </w:r>
+            <w:r>
+              <w:rPr>
+                <w:noProof/>
+                <w:webHidden/>
+              </w:rPr>
+              <w:t>5</w:t>
+            </w:r>
+            <w:r>
+              <w:rPr>
+                <w:noProof/>
+                <w:webHidden/>
+              </w:rPr>
+              <w:fldChar w:fldCharType="end"/>
+            </w:r>
+          </w:hyperlink>
+        </w:p>
+        <w:p>
+          <w:pPr>
+            <w:pStyle w:val="TM1"/>
+            <w:tabs>
+              <w:tab w:val="right" w:leader="dot" w:pos="9062"/>
+            </w:tabs>
+            <w:rPr>
+              <w:noProof/>
+            </w:rPr>
+          </w:pPr>
+          <w:hyperlink w:anchor="_Toc220499877" w:history="1">
+            <w:r>
+              <w:rPr>
+                <w:rStyle w:val="Lienhypertexte"/>
+                <w:noProof/>
+              </w:rPr>
+              <w:t>Boîte à outil commande SimConnect :</w:t>
+            </w:r>
+            <w:r>
+              <w:rPr>
+                <w:noProof/>
+                <w:webHidden/>
+              </w:rPr>
+              <w:tab/>
+            </w:r>
+            <w:r>
+              <w:rPr>
+                <w:noProof/>
+                <w:webHidden/>
+              </w:rPr>
+              <w:fldChar w:fldCharType="begin"/>
+            </w:r>
+            <w:r>
+              <w:rPr>
+                <w:noProof/>
+                <w:webHidden/>
+              </w:rPr>
+              <w:instrText xml:space="preserve"> PAGEREF _Toc220499877 \h </w:instrText>
+            </w:r>
+            <w:r>
+              <w:rPr>
+                <w:noProof/>
+                <w:webHidden/>
+              </w:rPr>
+            </w:r>
+            <w:r>
+              <w:rPr>
+                <w:noProof/>
+                <w:webHidden/>
+              </w:rPr>
+              <w:fldChar w:fldCharType="separate"/>
+            </w:r>
+            <w:r>
+              <w:rPr>
+                <w:noProof/>
+                <w:webHidden/>
+              </w:rPr>
+              <w:t>6</w:t>
+            </w:r>
+            <w:r>
+              <w:rPr>
+                <w:noProof/>
+                <w:webHidden/>
+              </w:rPr>
+              <w:fldChar w:fldCharType="end"/>
+            </w:r>
+          </w:hyperlink>
+        </w:p>
+        <w:p>
+          <w:pPr>
+            <w:pStyle w:val="TM2"/>
+            <w:tabs>
+              <w:tab w:val="right" w:leader="dot" w:pos="9062"/>
+            </w:tabs>
+            <w:rPr>
+              <w:noProof/>
+            </w:rPr>
+          </w:pPr>
+          <w:hyperlink w:anchor="_Toc220499878" w:history="1">
+            <w:r>
+              <w:rPr>
+                <w:rStyle w:val="Lienhypertexte"/>
+                <w:noProof/>
+              </w:rPr>
+              <w:t>Description et objectif :</w:t>
+            </w:r>
+            <w:r>
+              <w:rPr>
+                <w:noProof/>
+                <w:webHidden/>
+              </w:rPr>
+              <w:tab/>
+            </w:r>
+            <w:r>
+              <w:rPr>
+                <w:noProof/>
+                <w:webHidden/>
+              </w:rPr>
+              <w:fldChar w:fldCharType="begin"/>
+            </w:r>
+            <w:r>
+              <w:rPr>
+                <w:noProof/>
+                <w:webHidden/>
+              </w:rPr>
+              <w:instrText xml:space="preserve"> PAGEREF _Toc220499878 \h </w:instrText>
+            </w:r>
+            <w:r>
+              <w:rPr>
+                <w:noProof/>
+                <w:webHidden/>
+              </w:rPr>
+            </w:r>
+            <w:r>
+              <w:rPr>
+                <w:noProof/>
+                <w:webHidden/>
+              </w:rPr>
+              <w:fldChar w:fldCharType="separate"/>
+            </w:r>
+            <w:r>
+              <w:rPr>
+                <w:noProof/>
+                <w:webHidden/>
+              </w:rPr>
+              <w:t>6</w:t>
+            </w:r>
+            <w:r>
+              <w:rPr>
+                <w:noProof/>
+                <w:webHidden/>
+              </w:rPr>
+              <w:fldChar w:fldCharType="end"/>
+            </w:r>
+          </w:hyperlink>
+        </w:p>
+        <w:p>
+          <w:pPr>
+            <w:pStyle w:val="TM2"/>
+            <w:tabs>
+              <w:tab w:val="right" w:leader="dot" w:pos="9062"/>
+            </w:tabs>
+            <w:rPr>
+              <w:noProof/>
+            </w:rPr>
+          </w:pPr>
+          <w:hyperlink w:anchor="_Toc220499879" w:history="1">
+            <w:r>
+              <w:rPr>
+                <w:rStyle w:val="Lienhypertexte"/>
+                <w:noProof/>
+              </w:rPr>
+              <w:t>Exploration et expérimentation :</w:t>
+            </w:r>
+            <w:r>
+              <w:rPr>
+                <w:noProof/>
+                <w:webHidden/>
+              </w:rPr>
+              <w:tab/>
+            </w:r>
+            <w:r>
+              <w:rPr>
+                <w:noProof/>
+                <w:webHidden/>
+              </w:rPr>
+              <w:fldChar w:fldCharType="begin"/>
+            </w:r>
+            <w:r>
+              <w:rPr>
+                <w:noProof/>
+                <w:webHidden/>
+              </w:rPr>
+              <w:instrText xml:space="preserve"> PAGEREF _Toc220499879 \h </w:instrText>
+            </w:r>
+            <w:r>
+              <w:rPr>
+                <w:noProof/>
+                <w:webHidden/>
+              </w:rPr>
+            </w:r>
+            <w:r>
+              <w:rPr>
+                <w:noProof/>
+                <w:webHidden/>
+              </w:rPr>
+              <w:fldChar w:fldCharType="separate"/>
+            </w:r>
+            <w:r>
+              <w:rPr>
+                <w:noProof/>
+                <w:webHidden/>
+              </w:rPr>
+              <w:t>6</w:t>
+            </w:r>
+            <w:r>
+              <w:rPr>
+                <w:noProof/>
+                <w:webHidden/>
+              </w:rPr>
+              <w:fldChar w:fldCharType="end"/>
+            </w:r>
+          </w:hyperlink>
+        </w:p>
+        <w:p>
+          <w:pPr>
+            <w:pStyle w:val="TM2"/>
+            <w:tabs>
+              <w:tab w:val="right" w:leader="dot" w:pos="9062"/>
+            </w:tabs>
+            <w:rPr>
+              <w:noProof/>
+            </w:rPr>
+          </w:pPr>
+          <w:hyperlink w:anchor="_Toc220499880" w:history="1">
+            <w:r>
+              <w:rPr>
+                <w:rStyle w:val="Lienhypertexte"/>
+                <w:noProof/>
+              </w:rPr>
+              <w:t>Testes :</w:t>
+            </w:r>
+            <w:r>
+              <w:rPr>
+                <w:noProof/>
+                <w:webHidden/>
+              </w:rPr>
+              <w:tab/>
+            </w:r>
+            <w:r>
+              <w:rPr>
+                <w:noProof/>
+                <w:webHidden/>
+              </w:rPr>
+              <w:fldChar w:fldCharType="begin"/>
+            </w:r>
+            <w:r>
+              <w:rPr>
+                <w:noProof/>
+                <w:webHidden/>
+              </w:rPr>
+              <w:instrText xml:space="preserve"> PAGEREF _Toc220499880 \h </w:instrText>
+            </w:r>
+            <w:r>
+              <w:rPr>
+                <w:noProof/>
+                <w:webHidden/>
+              </w:rPr>
+            </w:r>
+            <w:r>
+              <w:rPr>
+                <w:noProof/>
+                <w:webHidden/>
+              </w:rPr>
+              <w:fldChar w:fldCharType="separate"/>
+            </w:r>
+            <w:r>
+              <w:rPr>
+                <w:noProof/>
+                <w:webHidden/>
+              </w:rPr>
+              <w:t>6</w:t>
+            </w:r>
+            <w:r>
+              <w:rPr>
+                <w:noProof/>
+                <w:webHidden/>
+              </w:rPr>
+              <w:fldChar w:fldCharType="end"/>
+            </w:r>
+          </w:hyperlink>
+        </w:p>
+        <w:p>
+          <w:pPr>
+            <w:pStyle w:val="TM2"/>
+            <w:tabs>
+              <w:tab w:val="right" w:leader="dot" w:pos="9062"/>
+            </w:tabs>
+            <w:rPr>
+              <w:noProof/>
+            </w:rPr>
+          </w:pPr>
+          <w:hyperlink w:anchor="_Toc220499881" w:history="1">
+            <w:r>
+              <w:rPr>
+                <w:rStyle w:val="Lienhypertexte"/>
+                <w:noProof/>
+              </w:rPr>
+              <w:t>Correction théorique :</w:t>
+            </w:r>
+            <w:r>
+              <w:rPr>
+                <w:noProof/>
+                <w:webHidden/>
+              </w:rPr>
+              <w:tab/>
+            </w:r>
+            <w:r>
+              <w:rPr>
+                <w:noProof/>
+                <w:webHidden/>
+              </w:rPr>
+              <w:fldChar w:fldCharType="begin"/>
+            </w:r>
+            <w:r>
+              <w:rPr>
+                <w:noProof/>
+                <w:webHidden/>
+              </w:rPr>
+              <w:instrText xml:space="preserve"> PAGEREF _Toc220499881 \h </w:instrText>
+            </w:r>
+            <w:r>
+              <w:rPr>
+                <w:noProof/>
+                <w:webHidden/>
+              </w:rPr>
+            </w:r>
+            <w:r>
+              <w:rPr>
+                <w:noProof/>
+                <w:webHidden/>
+              </w:rPr>
+              <w:fldChar w:fldCharType="separate"/>
+            </w:r>
+            <w:r>
+              <w:rPr>
+                <w:noProof/>
+                <w:webHidden/>
+              </w:rPr>
+              <w:t>6</w:t>
+            </w:r>
+            <w:r>
+              <w:rPr>
+                <w:noProof/>
+                <w:webHidden/>
+              </w:rPr>
+              <w:fldChar w:fldCharType="end"/>
+            </w:r>
+          </w:hyperlink>
+        </w:p>
+        <w:p>
+          <w:r>
+            <w:rPr>
+              <w:b/>
+              <w:bCs/>
+              <w:lang w:val="fr-FR"/>
+            </w:rPr>
+            <w:fldChar w:fldCharType="end"/>
+          </w:r>
+        </w:p>
+      </w:sdtContent>
+    </w:sdt>
+    <w:p>
+      <w:r>
+        <w:br w:type="page"/>
+      </w:r>
+    </w:p>
+    <w:p>
+      <w:pPr>
+        <w:pStyle w:val="Titre1"/>
+      </w:pPr>
+      <w:bookmarkStart w:id="0" w:name="_Toc220499868"/>
+      <w:r>
+        <w:lastRenderedPageBreak/>
         <w:t>Logi</w:t>
       </w:r>
       <w:r>
@@ -18,11 +1110,16 @@
       <w:r>
         <w:t>ol plat</w:t>
       </w:r>
-    </w:p>
-    <w:p>
-      <w:pPr>
-        <w:pStyle w:val="Titre1"/>
-      </w:pPr>
+      <w:r>
+        <w:t> :</w:t>
+      </w:r>
+      <w:bookmarkEnd w:id="0"/>
+    </w:p>
+    <w:p>
+      <w:pPr>
+        <w:pStyle w:val="Titre2"/>
+      </w:pPr>
+      <w:bookmarkStart w:id="1" w:name="_Toc220499869"/>
       <w:r>
         <w:t xml:space="preserve">Valeur </w:t>
       </w:r>
@@ -40,6 +1137,7 @@
       <w:r>
         <w:t>)</w:t>
       </w:r>
+      <w:bookmarkEnd w:id="1"/>
     </w:p>
     <w:p>
       <w:pPr>
@@ -152,8 +1250,9 @@
     </w:p>
     <w:p>
       <w:pPr>
-        <w:pStyle w:val="Titre1"/>
-      </w:pPr>
+        <w:pStyle w:val="Titre2"/>
+      </w:pPr>
+      <w:bookmarkStart w:id="2" w:name="_Toc220499870"/>
       <w:r>
         <w:t>Valeur à définir (</w:t>
       </w:r>
@@ -163,6 +1262,7 @@
       <w:r>
         <w:t>)</w:t>
       </w:r>
+      <w:bookmarkEnd w:id="2"/>
     </w:p>
     <w:p>
       <w:pPr>
@@ -243,12 +1343,14 @@
     </w:p>
     <w:p>
       <w:pPr>
-        <w:pStyle w:val="Titre1"/>
-      </w:pPr>
+        <w:pStyle w:val="Titre2"/>
+      </w:pPr>
+      <w:bookmarkStart w:id="3" w:name="_Toc220499871"/>
       <w:r>
         <w:lastRenderedPageBreak/>
         <w:t>Plat Roulis</w:t>
       </w:r>
+      <w:bookmarkEnd w:id="3"/>
     </w:p>
     <w:p>
       <w:r>
@@ -310,11 +1412,13 @@
     </w:p>
     <w:p>
       <w:pPr>
-        <w:pStyle w:val="Titre1"/>
-      </w:pPr>
+        <w:pStyle w:val="Titre2"/>
+      </w:pPr>
+      <w:bookmarkStart w:id="4" w:name="_Toc220499872"/>
       <w:r>
         <w:t>Plat Tangage et Vitesse N=vitesse demandée</w:t>
       </w:r>
+      <w:bookmarkEnd w:id="4"/>
     </w:p>
     <w:p>
       <w:r>
@@ -391,11 +1495,13 @@
     </w:p>
     <w:p>
       <w:pPr>
-        <w:pStyle w:val="Titre1"/>
-      </w:pPr>
+        <w:pStyle w:val="Titre2"/>
+      </w:pPr>
+      <w:bookmarkStart w:id="5" w:name="_Toc220499873"/>
       <w:r>
         <w:t>Direction N=angle départ</w:t>
       </w:r>
+      <w:bookmarkEnd w:id="5"/>
     </w:p>
     <w:p>
       <w:r>
@@ -472,20 +1578,24 @@
     </w:p>
     <w:p>
       <w:pPr>
-        <w:pStyle w:val="Titre1"/>
-      </w:pPr>
+        <w:pStyle w:val="Titre2"/>
+      </w:pPr>
+      <w:bookmarkStart w:id="6" w:name="_Toc220499874"/>
       <w:r>
         <w:lastRenderedPageBreak/>
         <w:t>Problèmes</w:t>
       </w:r>
-    </w:p>
-    <w:p>
-      <w:pPr>
-        <w:pStyle w:val="Titre2"/>
-      </w:pPr>
+      <w:bookmarkEnd w:id="6"/>
+    </w:p>
+    <w:p>
+      <w:pPr>
+        <w:pStyle w:val="Titre3"/>
+      </w:pPr>
+      <w:bookmarkStart w:id="7" w:name="_Toc220499875"/>
       <w:r>
         <w:t>Problème 1 :</w:t>
       </w:r>
+      <w:bookmarkEnd w:id="7"/>
     </w:p>
     <w:p>
       <w:r>
@@ -509,11 +1619,13 @@
     <w:p/>
     <w:p>
       <w:pPr>
-        <w:pStyle w:val="Titre2"/>
-      </w:pPr>
+        <w:pStyle w:val="Titre3"/>
+      </w:pPr>
+      <w:bookmarkStart w:id="8" w:name="_Toc220499876"/>
       <w:r>
         <w:t>Problème 2 :</w:t>
       </w:r>
+      <w:bookmarkEnd w:id="8"/>
     </w:p>
     <w:p>
       <w:r>
@@ -560,7 +1672,7 @@
                     <pic:cNvPicPr/>
                   </pic:nvPicPr>
                   <pic:blipFill>
-                    <a:blip r:embed="rId7"/>
+                    <a:blip r:embed="rId8"/>
                     <a:stretch>
                       <a:fillRect/>
                     </a:stretch>
@@ -638,14 +1750,946 @@
       </w:r>
     </w:p>
     <w:p>
-      <w:r>
+      <w:pPr>
+        <w:pStyle w:val="Titre1"/>
+      </w:pPr>
+      <w:r>
+        <w:lastRenderedPageBreak/>
         <w:t xml:space="preserve"> </w:t>
       </w:r>
+      <w:bookmarkStart w:id="9" w:name="_Toc220499877"/>
+      <w:r>
+        <w:t xml:space="preserve">Boîte à outil commande </w:t>
+      </w:r>
+      <w:proofErr w:type="spellStart"/>
+      <w:r>
+        <w:t>SimConnect</w:t>
+      </w:r>
+      <w:proofErr w:type="spellEnd"/>
+      <w:r>
+        <w:t> :</w:t>
+      </w:r>
+      <w:bookmarkEnd w:id="9"/>
+    </w:p>
+    <w:p>
+      <w:pPr>
+        <w:pStyle w:val="Titre2"/>
+      </w:pPr>
+      <w:bookmarkStart w:id="10" w:name="_Toc220499878"/>
+      <w:r>
+        <w:t>Description et objectif :</w:t>
+      </w:r>
+      <w:bookmarkEnd w:id="10"/>
+    </w:p>
+    <w:p>
+      <w:r>
+        <w:t xml:space="preserve">La boîte à outil est une bibliothèque utilisable pour tous les programmes du projet. Elle doit contenir les fonctionnalités nécessaires pour piloter le planeur sur </w:t>
+      </w:r>
+      <w:proofErr w:type="spellStart"/>
+      <w:r>
+        <w:t>FlightSimulator</w:t>
+      </w:r>
+      <w:proofErr w:type="spellEnd"/>
+      <w:r>
+        <w:t>. Il ne s’agit pas d’un exécutable, mais vraiment d’une pièce à intégrer à chaque projet qui requiert de piloter l’appareil.</w:t>
+      </w:r>
+    </w:p>
+    <w:p/>
+    <w:p>
+      <w:pPr>
+        <w:pStyle w:val="Titre2"/>
+      </w:pPr>
+      <w:bookmarkStart w:id="11" w:name="_Toc220499879"/>
+      <w:r>
+        <w:t>Exploration et expérimentation :</w:t>
+      </w:r>
+      <w:bookmarkEnd w:id="11"/>
+    </w:p>
+    <w:p>
+      <w:pPr>
+        <w:jc w:val="both"/>
+      </w:pPr>
+      <w:r>
+        <w:t xml:space="preserve">L’expérimentation pour réaliser la boîte à outil est chaotique. Les documentations sur </w:t>
+      </w:r>
+      <w:proofErr w:type="spellStart"/>
+      <w:r>
+        <w:t>SimConnect</w:t>
+      </w:r>
+      <w:proofErr w:type="spellEnd"/>
+      <w:r>
+        <w:t xml:space="preserve"> se contredisent, les exemples provoquent des erreurs sans même pouvoir se compiler, et même les mécanismes de </w:t>
+      </w:r>
+      <w:proofErr w:type="spellStart"/>
+      <w:r>
+        <w:t>SimConnect</w:t>
+      </w:r>
+      <w:proofErr w:type="spellEnd"/>
+      <w:r>
+        <w:t xml:space="preserve"> demandent parfois </w:t>
+      </w:r>
+      <w:proofErr w:type="gramStart"/>
+      <w:r>
+        <w:t>un dll obsolète</w:t>
+      </w:r>
+      <w:proofErr w:type="gramEnd"/>
+      <w:r>
+        <w:t xml:space="preserve"> ou un package plus ou moins utilisable. Il aura fallu des erreurs créer une première version qui</w:t>
+      </w:r>
+      <w:r>
+        <w:t xml:space="preserve"> ne se lancera pas malgré une longue session pour régler les soucis de compatibilités.</w:t>
+      </w:r>
+    </w:p>
+    <w:p>
+      <w:pPr>
+        <w:jc w:val="both"/>
+      </w:pPr>
+      <w:r>
+        <w:t>La boîte à outil étant nécessaire pour l’équipe pour travailler sur du concret, une révision d’efficacité a été entreprise et a permis de parvenir à une version 2 fonctionnelle bien que moins maîtrisée.</w:t>
+      </w:r>
+    </w:p>
+    <w:p>
+      <w:pPr>
+        <w:jc w:val="both"/>
+      </w:pPr>
+    </w:p>
+    <w:p>
+      <w:pPr>
+        <w:pStyle w:val="Titre2"/>
+      </w:pPr>
+      <w:bookmarkStart w:id="12" w:name="_Toc220499880"/>
+      <w:proofErr w:type="gramStart"/>
+      <w:r>
+        <w:t>Testes</w:t>
+      </w:r>
+      <w:proofErr w:type="gramEnd"/>
+      <w:r>
+        <w:t> :</w:t>
+      </w:r>
+      <w:bookmarkEnd w:id="12"/>
+    </w:p>
+    <w:p>
+      <w:pPr>
+        <w:jc w:val="both"/>
+      </w:pPr>
+      <w:r>
+        <w:t xml:space="preserve">Affin d’assurer le fonctionnement de la boîte à outil, deux exécutables ont été créés. Le premier consistait à lancer une liste d’instruction de pilotage, une après l’autre, à chaque pression d’une touche de clavier. Le second était un test interactif, les instructions étaient </w:t>
+      </w:r>
+      <w:proofErr w:type="gramStart"/>
+      <w:r>
+        <w:t>bruts</w:t>
+      </w:r>
+      <w:proofErr w:type="gramEnd"/>
+      <w:r>
+        <w:t>, mais pouvais être choisie sur le clavier à plusieurs reprises.</w:t>
+      </w:r>
+    </w:p>
+    <w:p>
+      <w:pPr>
+        <w:jc w:val="both"/>
+      </w:pPr>
+      <w:r>
+        <w:t>Le résultat à été positif même si le planeur ne restait pas longtemps en vol.</w:t>
+      </w:r>
+    </w:p>
+    <w:p>
+      <w:pPr>
+        <w:jc w:val="both"/>
+      </w:pPr>
+    </w:p>
+    <w:p>
+      <w:pPr>
+        <w:pStyle w:val="Titre2"/>
+      </w:pPr>
+      <w:r>
+        <w:t>Fonctionnement :</w:t>
+      </w:r>
+    </w:p>
+    <w:p>
+      <w:pPr>
+        <w:jc w:val="both"/>
+      </w:pPr>
+      <w:r>
+        <w:t xml:space="preserve">Toutes les commandes commencent par un </w:t>
+      </w:r>
+      <w:proofErr w:type="spellStart"/>
+      <w:r>
+        <w:t>await</w:t>
+      </w:r>
+      <w:proofErr w:type="spellEnd"/>
+      <w:r>
+        <w:t>, son objectif est d’attendre que le simulateur ait bien reçu l’instruction avant de continuer à l’exécuter. Ceci permet entre autres d’assurer une coordination entre la commande demandée par le programme et sa réalisation sur le simulateur.</w:t>
+      </w:r>
+    </w:p>
+    <w:p>
+      <w:pPr>
+        <w:jc w:val="both"/>
+      </w:pPr>
+      <w:r>
+        <w:t xml:space="preserve">Ces commandes sont construites par le constructeur présent dans </w:t>
+      </w:r>
+      <w:proofErr w:type="spellStart"/>
+      <w:r>
+        <w:t>commandes.cs</w:t>
+      </w:r>
+      <w:proofErr w:type="spellEnd"/>
+      <w:r>
+        <w:t xml:space="preserve"> suivant ce procédé :</w:t>
+      </w:r>
+    </w:p>
+    <w:p>
+      <w:pPr>
+        <w:jc w:val="both"/>
+      </w:pPr>
+    </w:p>
+    <w:p>
+      <w:pPr>
+        <w:jc w:val="both"/>
+        <w:rPr>
+          <w:lang w:val="en-GB"/>
+        </w:rPr>
+      </w:pPr>
+      <w:r>
+        <w:rPr>
+          <w:lang w:val="en-GB"/>
+        </w:rPr>
+        <w:lastRenderedPageBreak/>
+        <w:t xml:space="preserve">public </w:t>
+      </w:r>
+      <w:proofErr w:type="spellStart"/>
+      <w:proofErr w:type="gramStart"/>
+      <w:r>
+        <w:rPr>
+          <w:lang w:val="en-GB"/>
+        </w:rPr>
+        <w:t>SimConnectControls</w:t>
+      </w:r>
+      <w:proofErr w:type="spellEnd"/>
+      <w:r>
+        <w:rPr>
+          <w:lang w:val="en-GB"/>
+        </w:rPr>
+        <w:t>(</w:t>
+      </w:r>
+      <w:proofErr w:type="spellStart"/>
+      <w:proofErr w:type="gramEnd"/>
+      <w:r>
+        <w:rPr>
+          <w:lang w:val="en-GB"/>
+        </w:rPr>
+        <w:t>SimConnectClient</w:t>
+      </w:r>
+      <w:proofErr w:type="spellEnd"/>
+      <w:r>
+        <w:rPr>
+          <w:lang w:val="en-GB"/>
+        </w:rPr>
+        <w:t xml:space="preserve"> sim)</w:t>
+      </w:r>
+    </w:p>
+    <w:p>
+      <w:pPr>
+        <w:jc w:val="both"/>
+        <w:rPr>
+          <w:lang w:val="en-GB"/>
+        </w:rPr>
+      </w:pPr>
+      <w:r>
+        <w:rPr>
+          <w:lang w:val="en-GB"/>
+        </w:rPr>
+        <w:t xml:space="preserve">        {</w:t>
+      </w:r>
+    </w:p>
+    <w:p>
+      <w:pPr>
+        <w:jc w:val="both"/>
+        <w:rPr>
+          <w:lang w:val="en-GB"/>
+        </w:rPr>
+      </w:pPr>
+      <w:r>
+        <w:rPr>
+          <w:lang w:val="en-GB"/>
+        </w:rPr>
+        <w:t xml:space="preserve">            _sim = sim ?? throw new </w:t>
+      </w:r>
+      <w:proofErr w:type="spellStart"/>
+      <w:r>
+        <w:rPr>
+          <w:lang w:val="en-GB"/>
+        </w:rPr>
+        <w:t>ArgumentNullException</w:t>
+      </w:r>
+      <w:proofErr w:type="spellEnd"/>
+      <w:r>
+        <w:rPr>
+          <w:lang w:val="en-GB"/>
+        </w:rPr>
+        <w:t>(</w:t>
+      </w:r>
+      <w:proofErr w:type="spellStart"/>
+      <w:r>
+        <w:rPr>
+          <w:lang w:val="en-GB"/>
+        </w:rPr>
+        <w:t>nameof</w:t>
+      </w:r>
+      <w:proofErr w:type="spellEnd"/>
+      <w:r>
+        <w:rPr>
+          <w:lang w:val="en-GB"/>
+        </w:rPr>
+        <w:t>(sim)</w:t>
+      </w:r>
+      <w:proofErr w:type="gramStart"/>
+      <w:r>
+        <w:rPr>
+          <w:lang w:val="en-GB"/>
+        </w:rPr>
+        <w:t>);</w:t>
+      </w:r>
+      <w:proofErr w:type="gramEnd"/>
+    </w:p>
+    <w:p>
+      <w:pPr>
+        <w:jc w:val="both"/>
+      </w:pPr>
+      <w:r>
+        <w:rPr>
+          <w:lang w:val="en-GB"/>
+        </w:rPr>
+        <w:t xml:space="preserve">        </w:t>
+      </w:r>
+      <w:r>
+        <w:t>}</w:t>
+      </w:r>
+    </w:p>
+    <w:p/>
+    <w:p>
+      <w:r>
+        <w:t>Bouger l'aileron :</w:t>
+      </w:r>
+    </w:p>
+    <w:p>
+      <w:r>
+        <w:tab/>
+      </w:r>
+      <w:proofErr w:type="spellStart"/>
+      <w:proofErr w:type="gramStart"/>
+      <w:r>
+        <w:t>await</w:t>
+      </w:r>
+      <w:proofErr w:type="spellEnd"/>
+      <w:proofErr w:type="gramEnd"/>
+      <w:r>
+        <w:t xml:space="preserve"> </w:t>
+      </w:r>
+      <w:proofErr w:type="spellStart"/>
+      <w:proofErr w:type="gramStart"/>
+      <w:r>
+        <w:t>controls.SetAileron</w:t>
+      </w:r>
+      <w:proofErr w:type="spellEnd"/>
+      <w:proofErr w:type="gramEnd"/>
+      <w:r>
+        <w:t>("valeur"</w:t>
+      </w:r>
+      <w:proofErr w:type="gramStart"/>
+      <w:r>
+        <w:t>);</w:t>
+      </w:r>
+      <w:proofErr w:type="gramEnd"/>
+    </w:p>
+    <w:p>
+      <w:pPr>
+        <w:jc w:val="both"/>
+      </w:pPr>
+      <w:r>
+        <w:t>La valeur attendue par la commande permet de déterminer quel aileron doit faire quoi. Elle attend une valeur comprise entre -1 et +1. Par exemple, une valeur à -1 va demander à l’aileron gauche de s’incliner au maximum, à l’inverse, +1 va plutôt demander à l’aileron droit. La valeur 0 consiste à demander aux ailerons de ne plus avoir d’inclinaison.</w:t>
+      </w:r>
+    </w:p>
+    <w:p>
+      <w:r>
+        <w:t>Commande construite :</w:t>
+      </w:r>
+    </w:p>
+    <w:p>
+      <w:pPr>
+        <w:rPr>
+          <w:lang w:val="en-GB"/>
+        </w:rPr>
+      </w:pPr>
+      <w:r>
+        <w:rPr>
+          <w:lang w:val="en-GB"/>
+        </w:rPr>
+        <w:t xml:space="preserve">public async Task </w:t>
+      </w:r>
+      <w:proofErr w:type="spellStart"/>
+      <w:proofErr w:type="gramStart"/>
+      <w:r>
+        <w:rPr>
+          <w:lang w:val="en-GB"/>
+        </w:rPr>
+        <w:t>SetAileron</w:t>
+      </w:r>
+      <w:proofErr w:type="spellEnd"/>
+      <w:r>
+        <w:rPr>
+          <w:lang w:val="en-GB"/>
+        </w:rPr>
+        <w:t>(</w:t>
+      </w:r>
+      <w:proofErr w:type="gramEnd"/>
+      <w:r>
+        <w:rPr>
+          <w:lang w:val="en-GB"/>
+        </w:rPr>
+        <w:t>double value)</w:t>
+      </w:r>
+    </w:p>
+    <w:p>
+      <w:pPr>
+        <w:rPr>
+          <w:lang w:val="en-GB"/>
+        </w:rPr>
+      </w:pPr>
+      <w:r>
+        <w:rPr>
+          <w:lang w:val="en-GB"/>
+        </w:rPr>
+        <w:t xml:space="preserve">        {</w:t>
+      </w:r>
+    </w:p>
+    <w:p>
+      <w:pPr>
+        <w:rPr>
+          <w:lang w:val="en-GB"/>
+        </w:rPr>
+      </w:pPr>
+      <w:r>
+        <w:rPr>
+          <w:lang w:val="en-GB"/>
+        </w:rPr>
+        <w:t xml:space="preserve">            value = </w:t>
+      </w:r>
+      <w:proofErr w:type="spellStart"/>
+      <w:r>
+        <w:rPr>
+          <w:lang w:val="en-GB"/>
+        </w:rPr>
+        <w:t>Math.Max</w:t>
+      </w:r>
+      <w:proofErr w:type="spellEnd"/>
+      <w:r>
+        <w:rPr>
+          <w:lang w:val="en-GB"/>
+        </w:rPr>
+        <w:t xml:space="preserve">(-1.0, </w:t>
+      </w:r>
+      <w:proofErr w:type="spellStart"/>
+      <w:r>
+        <w:rPr>
+          <w:lang w:val="en-GB"/>
+        </w:rPr>
+        <w:t>Math.Min</w:t>
+      </w:r>
+      <w:proofErr w:type="spellEnd"/>
+      <w:r>
+        <w:rPr>
+          <w:lang w:val="en-GB"/>
+        </w:rPr>
+        <w:t>(1.0, value)</w:t>
+      </w:r>
+      <w:proofErr w:type="gramStart"/>
+      <w:r>
+        <w:rPr>
+          <w:lang w:val="en-GB"/>
+        </w:rPr>
+        <w:t>);</w:t>
+      </w:r>
+      <w:proofErr w:type="gramEnd"/>
+    </w:p>
+    <w:p>
+      <w:r>
+        <w:rPr>
+          <w:lang w:val="en-GB"/>
+        </w:rPr>
+        <w:t xml:space="preserve">            </w:t>
+      </w:r>
+      <w:proofErr w:type="spellStart"/>
+      <w:proofErr w:type="gramStart"/>
+      <w:r>
+        <w:t>await</w:t>
+      </w:r>
+      <w:proofErr w:type="spellEnd"/>
+      <w:proofErr w:type="gramEnd"/>
+      <w:r>
+        <w:t xml:space="preserve"> _</w:t>
+      </w:r>
+      <w:proofErr w:type="spellStart"/>
+      <w:proofErr w:type="gramStart"/>
+      <w:r>
+        <w:t>sim.SimVars.SetAsync</w:t>
+      </w:r>
+      <w:proofErr w:type="spellEnd"/>
+      <w:proofErr w:type="gramEnd"/>
+      <w:r>
+        <w:t>("AILERON POSITION", "position", value</w:t>
+      </w:r>
+      <w:proofErr w:type="gramStart"/>
+      <w:r>
+        <w:t>);</w:t>
+      </w:r>
+      <w:proofErr w:type="gramEnd"/>
+    </w:p>
+    <w:p>
+      <w:r>
+        <w:t xml:space="preserve">        }</w:t>
+      </w:r>
+    </w:p>
+    <w:p/>
+    <w:p/>
+    <w:p>
+      <w:r>
+        <w:t>Changer l'</w:t>
+      </w:r>
+      <w:proofErr w:type="spellStart"/>
+      <w:r>
+        <w:t>elevateur</w:t>
+      </w:r>
+      <w:proofErr w:type="spellEnd"/>
+      <w:r>
+        <w:t xml:space="preserve"> :</w:t>
+      </w:r>
+    </w:p>
+    <w:p>
+      <w:r>
+        <w:tab/>
+      </w:r>
+      <w:proofErr w:type="spellStart"/>
+      <w:proofErr w:type="gramStart"/>
+      <w:r>
+        <w:t>await</w:t>
+      </w:r>
+      <w:proofErr w:type="spellEnd"/>
+      <w:proofErr w:type="gramEnd"/>
+      <w:r>
+        <w:t xml:space="preserve"> </w:t>
+      </w:r>
+      <w:proofErr w:type="spellStart"/>
+      <w:proofErr w:type="gramStart"/>
+      <w:r>
+        <w:t>controls.SetElevator</w:t>
+      </w:r>
+      <w:proofErr w:type="spellEnd"/>
+      <w:proofErr w:type="gramEnd"/>
+      <w:r>
+        <w:t>("valeur"</w:t>
+      </w:r>
+      <w:proofErr w:type="gramStart"/>
+      <w:r>
+        <w:t>);</w:t>
+      </w:r>
+      <w:proofErr w:type="gramEnd"/>
+    </w:p>
+    <w:p>
+      <w:r>
+        <w:t>L’</w:t>
+      </w:r>
+      <w:proofErr w:type="spellStart"/>
+      <w:r>
+        <w:t>elevateur</w:t>
+      </w:r>
+      <w:proofErr w:type="spellEnd"/>
+      <w:r>
+        <w:t xml:space="preserve"> fonctionne de la même manière, il détermine l’inclinaison du nez de l’appareil, avec un +1 nous demandons au nez de se lever au maximum vers le haut tandis avec -1 de descendre, ce qui correspond à une piquée dans ce dernier cas. La valeur 0 est donc pour rester plat.</w:t>
+      </w:r>
+    </w:p>
+    <w:p>
+      <w:r>
+        <w:t>Commande construite :</w:t>
+      </w:r>
+    </w:p>
+    <w:p>
+      <w:pPr>
+        <w:rPr>
+          <w:lang w:val="en-GB"/>
+        </w:rPr>
+      </w:pPr>
+      <w:r>
+        <w:rPr>
+          <w:lang w:val="en-GB"/>
+        </w:rPr>
+        <w:t xml:space="preserve">public async Task </w:t>
+      </w:r>
+      <w:proofErr w:type="spellStart"/>
+      <w:proofErr w:type="gramStart"/>
+      <w:r>
+        <w:rPr>
+          <w:lang w:val="en-GB"/>
+        </w:rPr>
+        <w:t>SetElevator</w:t>
+      </w:r>
+      <w:proofErr w:type="spellEnd"/>
+      <w:r>
+        <w:rPr>
+          <w:lang w:val="en-GB"/>
+        </w:rPr>
+        <w:t>(</w:t>
+      </w:r>
+      <w:proofErr w:type="gramEnd"/>
+      <w:r>
+        <w:rPr>
+          <w:lang w:val="en-GB"/>
+        </w:rPr>
+        <w:t>double value)</w:t>
+      </w:r>
+    </w:p>
+    <w:p>
+      <w:pPr>
+        <w:rPr>
+          <w:lang w:val="en-GB"/>
+        </w:rPr>
+      </w:pPr>
+      <w:r>
+        <w:rPr>
+          <w:lang w:val="en-GB"/>
+        </w:rPr>
+        <w:t xml:space="preserve">        {</w:t>
+      </w:r>
+    </w:p>
+    <w:p>
+      <w:pPr>
+        <w:rPr>
+          <w:lang w:val="en-GB"/>
+        </w:rPr>
+      </w:pPr>
+      <w:r>
+        <w:rPr>
+          <w:lang w:val="en-GB"/>
+        </w:rPr>
+        <w:t xml:space="preserve">            value = </w:t>
+      </w:r>
+      <w:proofErr w:type="spellStart"/>
+      <w:r>
+        <w:rPr>
+          <w:lang w:val="en-GB"/>
+        </w:rPr>
+        <w:t>Math.Max</w:t>
+      </w:r>
+      <w:proofErr w:type="spellEnd"/>
+      <w:r>
+        <w:rPr>
+          <w:lang w:val="en-GB"/>
+        </w:rPr>
+        <w:t xml:space="preserve">(-1.0, </w:t>
+      </w:r>
+      <w:proofErr w:type="spellStart"/>
+      <w:r>
+        <w:rPr>
+          <w:lang w:val="en-GB"/>
+        </w:rPr>
+        <w:t>Math.Min</w:t>
+      </w:r>
+      <w:proofErr w:type="spellEnd"/>
+      <w:r>
+        <w:rPr>
+          <w:lang w:val="en-GB"/>
+        </w:rPr>
+        <w:t>(1.0, value)</w:t>
+      </w:r>
+      <w:proofErr w:type="gramStart"/>
+      <w:r>
+        <w:rPr>
+          <w:lang w:val="en-GB"/>
+        </w:rPr>
+        <w:t>);</w:t>
+      </w:r>
+      <w:proofErr w:type="gramEnd"/>
+    </w:p>
+    <w:p>
+      <w:r>
+        <w:rPr>
+          <w:lang w:val="en-GB"/>
+        </w:rPr>
+        <w:t xml:space="preserve">            </w:t>
+      </w:r>
+      <w:proofErr w:type="spellStart"/>
+      <w:proofErr w:type="gramStart"/>
+      <w:r>
+        <w:t>await</w:t>
+      </w:r>
+      <w:proofErr w:type="spellEnd"/>
+      <w:proofErr w:type="gramEnd"/>
+      <w:r>
+        <w:t xml:space="preserve"> _</w:t>
+      </w:r>
+      <w:proofErr w:type="spellStart"/>
+      <w:proofErr w:type="gramStart"/>
+      <w:r>
+        <w:t>sim.SimVars.SetAsync</w:t>
+      </w:r>
+      <w:proofErr w:type="spellEnd"/>
+      <w:proofErr w:type="gramEnd"/>
+      <w:r>
+        <w:t>("ELEVATOR POSITION", "position", value</w:t>
+      </w:r>
+      <w:proofErr w:type="gramStart"/>
+      <w:r>
+        <w:t>);</w:t>
+      </w:r>
+      <w:proofErr w:type="gramEnd"/>
+    </w:p>
+    <w:p>
+      <w:r>
+        <w:lastRenderedPageBreak/>
+        <w:t xml:space="preserve">        }</w:t>
+      </w:r>
+    </w:p>
+    <w:p/>
+    <w:p/>
+    <w:p>
+      <w:r>
+        <w:t xml:space="preserve">Changer le </w:t>
+      </w:r>
+      <w:proofErr w:type="spellStart"/>
+      <w:r>
+        <w:t>rudder</w:t>
+      </w:r>
+      <w:proofErr w:type="spellEnd"/>
+      <w:r>
+        <w:t xml:space="preserve"> :</w:t>
+      </w:r>
+    </w:p>
+    <w:p>
+      <w:r>
+        <w:tab/>
+      </w:r>
+      <w:proofErr w:type="spellStart"/>
+      <w:proofErr w:type="gramStart"/>
+      <w:r>
+        <w:t>await</w:t>
+      </w:r>
+      <w:proofErr w:type="spellEnd"/>
+      <w:proofErr w:type="gramEnd"/>
+      <w:r>
+        <w:t xml:space="preserve"> </w:t>
+      </w:r>
+      <w:proofErr w:type="spellStart"/>
+      <w:proofErr w:type="gramStart"/>
+      <w:r>
+        <w:t>controls.SetRudder</w:t>
+      </w:r>
+      <w:proofErr w:type="spellEnd"/>
+      <w:proofErr w:type="gramEnd"/>
+      <w:r>
+        <w:t>("valeur"</w:t>
+      </w:r>
+      <w:proofErr w:type="gramStart"/>
+      <w:r>
+        <w:t>);</w:t>
+      </w:r>
+      <w:proofErr w:type="gramEnd"/>
+    </w:p>
+    <w:p>
+      <w:pPr>
+        <w:jc w:val="both"/>
+      </w:pPr>
+      <w:r>
+        <w:t xml:space="preserve">Le </w:t>
+      </w:r>
+      <w:proofErr w:type="spellStart"/>
+      <w:r>
+        <w:t>rudder</w:t>
+      </w:r>
+      <w:proofErr w:type="spellEnd"/>
+      <w:r>
+        <w:t xml:space="preserve"> est similaire aux ailerons, c’est un élément déterminant pour un </w:t>
+      </w:r>
+      <w:proofErr w:type="gramStart"/>
+      <w:r>
+        <w:t>dérapage  ou</w:t>
+      </w:r>
+      <w:proofErr w:type="gramEnd"/>
+      <w:r>
+        <w:t xml:space="preserve"> pour mener un virage efficacement.</w:t>
+      </w:r>
+    </w:p>
+    <w:p>
+      <w:pPr>
+        <w:jc w:val="both"/>
+      </w:pPr>
+      <w:r>
+        <w:t>Commande construite :</w:t>
+      </w:r>
+    </w:p>
+    <w:p>
+      <w:pPr>
+        <w:jc w:val="both"/>
+        <w:rPr>
+          <w:lang w:val="en-GB"/>
+        </w:rPr>
+      </w:pPr>
+      <w:r>
+        <w:rPr>
+          <w:lang w:val="en-GB"/>
+        </w:rPr>
+        <w:t xml:space="preserve">public async Task </w:t>
+      </w:r>
+      <w:proofErr w:type="spellStart"/>
+      <w:proofErr w:type="gramStart"/>
+      <w:r>
+        <w:rPr>
+          <w:lang w:val="en-GB"/>
+        </w:rPr>
+        <w:t>SetElevator</w:t>
+      </w:r>
+      <w:proofErr w:type="spellEnd"/>
+      <w:r>
+        <w:rPr>
+          <w:lang w:val="en-GB"/>
+        </w:rPr>
+        <w:t>(</w:t>
+      </w:r>
+      <w:proofErr w:type="gramEnd"/>
+      <w:r>
+        <w:rPr>
+          <w:lang w:val="en-GB"/>
+        </w:rPr>
+        <w:t>double value)</w:t>
+      </w:r>
+    </w:p>
+    <w:p>
+      <w:pPr>
+        <w:jc w:val="both"/>
+        <w:rPr>
+          <w:lang w:val="en-GB"/>
+        </w:rPr>
+      </w:pPr>
+      <w:r>
+        <w:rPr>
+          <w:lang w:val="en-GB"/>
+        </w:rPr>
+        <w:t xml:space="preserve">        {</w:t>
+      </w:r>
+    </w:p>
+    <w:p>
+      <w:pPr>
+        <w:jc w:val="both"/>
+        <w:rPr>
+          <w:lang w:val="en-GB"/>
+        </w:rPr>
+      </w:pPr>
+      <w:r>
+        <w:rPr>
+          <w:lang w:val="en-GB"/>
+        </w:rPr>
+        <w:t xml:space="preserve">            value = </w:t>
+      </w:r>
+      <w:proofErr w:type="spellStart"/>
+      <w:r>
+        <w:rPr>
+          <w:lang w:val="en-GB"/>
+        </w:rPr>
+        <w:t>Math.Max</w:t>
+      </w:r>
+      <w:proofErr w:type="spellEnd"/>
+      <w:r>
+        <w:rPr>
+          <w:lang w:val="en-GB"/>
+        </w:rPr>
+        <w:t xml:space="preserve">(-1.0, </w:t>
+      </w:r>
+      <w:proofErr w:type="spellStart"/>
+      <w:r>
+        <w:rPr>
+          <w:lang w:val="en-GB"/>
+        </w:rPr>
+        <w:t>Math.Min</w:t>
+      </w:r>
+      <w:proofErr w:type="spellEnd"/>
+      <w:r>
+        <w:rPr>
+          <w:lang w:val="en-GB"/>
+        </w:rPr>
+        <w:t>(1.0, value)</w:t>
+      </w:r>
+      <w:proofErr w:type="gramStart"/>
+      <w:r>
+        <w:rPr>
+          <w:lang w:val="en-GB"/>
+        </w:rPr>
+        <w:t>);</w:t>
+      </w:r>
+      <w:proofErr w:type="gramEnd"/>
+    </w:p>
+    <w:p>
+      <w:pPr>
+        <w:jc w:val="both"/>
+      </w:pPr>
+      <w:r>
+        <w:rPr>
+          <w:lang w:val="en-GB"/>
+        </w:rPr>
+        <w:t xml:space="preserve">            </w:t>
+      </w:r>
+      <w:proofErr w:type="spellStart"/>
+      <w:proofErr w:type="gramStart"/>
+      <w:r>
+        <w:t>await</w:t>
+      </w:r>
+      <w:proofErr w:type="spellEnd"/>
+      <w:proofErr w:type="gramEnd"/>
+      <w:r>
+        <w:t xml:space="preserve"> _</w:t>
+      </w:r>
+      <w:proofErr w:type="spellStart"/>
+      <w:proofErr w:type="gramStart"/>
+      <w:r>
+        <w:t>sim.SimVars.SetAsync</w:t>
+      </w:r>
+      <w:proofErr w:type="spellEnd"/>
+      <w:proofErr w:type="gramEnd"/>
+      <w:r>
+        <w:t>("ELEVATOR POSITION", "position", value</w:t>
+      </w:r>
+      <w:proofErr w:type="gramStart"/>
+      <w:r>
+        <w:t>);</w:t>
+      </w:r>
+      <w:proofErr w:type="gramEnd"/>
+    </w:p>
+    <w:p>
+      <w:pPr>
+        <w:jc w:val="both"/>
+      </w:pPr>
+      <w:r>
+        <w:t xml:space="preserve">        }</w:t>
+      </w:r>
+    </w:p>
+    <w:p>
+      <w:pPr>
+        <w:pStyle w:val="Titre2"/>
+      </w:pPr>
+      <w:bookmarkStart w:id="13" w:name="_Toc220499881"/>
+      <w:r>
+        <w:t>Correction théorique :</w:t>
+      </w:r>
+      <w:bookmarkEnd w:id="13"/>
+    </w:p>
+    <w:p>
+      <w:r>
+        <w:t>Initialement, il était pensé de créer les commandes dans un fichier et de les référencer dans un fichier interface afin qu’elles puissent être appelées dans l’exécutable. Cette théorie était erronée, l’interface n’étant en réalité pas nécessaire bien qu’elle soit un bon élément.</w:t>
+      </w:r>
     </w:p>
     <w:sectPr>
+      <w:footerReference w:type="default" r:id="rId9"/>
       <w:pgSz w:w="11906" w:h="16838"/>
       <w:pgMar w:top="1417" w:right="1417" w:bottom="1417" w:left="1417" w:header="708" w:footer="708" w:gutter="0"/>
       <w:cols w:space="708"/>
+      <w:titlePg/>
       <w:docGrid w:linePitch="360"/>
     </w:sectPr>
   </w:body>
@@ -675,6 +2719,50 @@
     </w:p>
   </w:endnote>
 </w:endnotes>
+</file>
+
+<file path=word/footer1.xml><?xml version="1.0" encoding="utf-8"?>
+<w:ftr xmlns:wpc="http://schemas.microsoft.com/office/word/2010/wordprocessingCanvas" xmlns:cx="http://schemas.microsoft.com/office/drawing/2014/chartex" xmlns:cx1="http://schemas.microsoft.com/office/drawing/2015/9/8/chartex" xmlns:cx2="http://schemas.microsoft.com/office/drawing/2015/10/21/chartex" xmlns:cx3="http://schemas.microsoft.com/office/drawing/2016/5/9/chartex" xmlns:cx4="http://schemas.microsoft.com/office/drawing/2016/5/10/chartex" xmlns:cx5="http://schemas.microsoft.com/office/drawing/2016/5/11/chartex" xmlns:cx6="http://schemas.microsoft.com/office/drawing/2016/5/12/chartex" xmlns:cx7="http://schemas.microsoft.com/office/drawing/2016/5/13/chartex" xmlns:cx8="http://schemas.microsoft.com/office/drawing/2016/5/14/chartex" xmlns:mc="http://schemas.openxmlformats.org/markup-compatibility/2006" xmlns:aink="http://schemas.microsoft.com/office/drawing/2016/ink" xmlns:am3d="http://schemas.microsoft.com/office/drawing/2017/model3d" xmlns:o="urn:schemas-microsoft-com:office:office" xmlns:oel="http://schemas.microsoft.com/office/2019/extlst" xmlns:r="http://schemas.openxmlformats.org/officeDocument/2006/relationships" xmlns:m="http://schemas.openxmlformats.org/officeDocument/2006/math" xmlns:v="urn:schemas-microsoft-com:vml" xmlns:wp14="http://schemas.microsoft.com/office/word/2010/wordprocessingDrawing" xmlns:wp="http://schemas.openxmlformats.org/drawingml/2006/wordprocessingDrawing" xmlns:w10="urn:schemas-microsoft-com:office:word" xmlns:w="http://schemas.openxmlformats.org/wordprocessingml/2006/main" xmlns:w14="http://schemas.microsoft.com/office/word/2010/wordml" xmlns:w15="http://schemas.microsoft.com/office/word/2012/wordml" xmlns:w16cex="http://schemas.microsoft.com/office/word/2018/wordml/cex" xmlns:w16cid="http://schemas.microsoft.com/office/word/2016/wordml/cid" xmlns:w16="http://schemas.microsoft.com/office/word/2018/wordml" xmlns:w16du="http://schemas.microsoft.com/office/word/2023/wordml/word16du" xmlns:w16sdtdh="http://schemas.microsoft.com/office/word/2020/wordml/sdtdatahash" xmlns:w16sdtfl="http://schemas.microsoft.com/office/word/2024/wordml/sdtformatlock" xmlns:w16se="http://schemas.microsoft.com/office/word/2015/wordml/symex" xmlns:wpg="http://schemas.microsoft.com/office/word/2010/wordprocessingGroup" xmlns:wpi="http://schemas.microsoft.com/office/word/2010/wordprocessingInk" xmlns:wne="http://schemas.microsoft.com/office/word/2006/wordml" xmlns:wps="http://schemas.microsoft.com/office/word/2010/wordprocessingShape" mc:Ignorable="w14 w15 w16se w16cid w16 w16cex w16sdtdh w16sdtfl w16du wp14">
+  <w:sdt>
+    <w:sdtPr>
+      <w:id w:val="343596696"/>
+      <w:docPartObj>
+        <w:docPartGallery w:val="Page Numbers (Bottom of Page)"/>
+        <w:docPartUnique/>
+      </w:docPartObj>
+    </w:sdtPr>
+    <w:sdtContent>
+      <w:p>
+        <w:pPr>
+          <w:pStyle w:val="Pieddepage"/>
+        </w:pPr>
+        <w:r>
+          <w:fldChar w:fldCharType="begin"/>
+        </w:r>
+        <w:r>
+          <w:instrText>PAGE   \* MERGEFORMAT</w:instrText>
+        </w:r>
+        <w:r>
+          <w:fldChar w:fldCharType="separate"/>
+        </w:r>
+        <w:r>
+          <w:rPr>
+            <w:lang w:val="fr-FR"/>
+          </w:rPr>
+          <w:t>2</w:t>
+        </w:r>
+        <w:r>
+          <w:fldChar w:fldCharType="end"/>
+        </w:r>
+      </w:p>
+    </w:sdtContent>
+  </w:sdt>
+  <w:p>
+    <w:pPr>
+      <w:pStyle w:val="Pieddepage"/>
+    </w:pPr>
+  </w:p>
+</w:ftr>
 </file>
 
 <file path=word/footnotes.xml><?xml version="1.0" encoding="utf-8"?>
@@ -2525,7 +4613,6 @@
     <w:next w:val="Normal"/>
     <w:link w:val="Titre3Car"/>
     <w:uiPriority w:val="9"/>
-    <w:semiHidden/>
     <w:unhideWhenUsed/>
     <w:qFormat/>
     <w:rsid w:val="007D662B"/>
@@ -2732,7 +4819,6 @@
     <w:basedOn w:val="Policepardfaut"/>
     <w:link w:val="Titre3"/>
     <w:uiPriority w:val="9"/>
-    <w:semiHidden/>
     <w:rsid w:val="007D662B"/>
     <w:rPr>
       <w:rFonts w:eastAsiaTheme="majorEastAsia" w:cstheme="majorBidi"/>
@@ -3034,6 +5120,75 @@
     <w:uiPriority w:val="99"/>
     <w:rsid w:val="008452BC"/>
   </w:style>
+  <w:style w:type="paragraph" w:styleId="En-ttedetabledesmatires">
+    <w:name w:val="TOC Heading"/>
+    <w:basedOn w:val="Titre1"/>
+    <w:next w:val="Normal"/>
+    <w:uiPriority w:val="39"/>
+    <w:unhideWhenUsed/>
+    <w:qFormat/>
+    <w:rsid w:val="00034951"/>
+    <w:pPr>
+      <w:spacing w:before="240" w:after="0" w:line="259" w:lineRule="auto"/>
+      <w:outlineLvl w:val="9"/>
+    </w:pPr>
+    <w:rPr>
+      <w:kern w:val="0"/>
+      <w:sz w:val="32"/>
+      <w:szCs w:val="32"/>
+      <w:lang w:eastAsia="fr-CH"/>
+      <w14:ligatures w14:val="none"/>
+    </w:rPr>
+  </w:style>
+  <w:style w:type="paragraph" w:styleId="TM1">
+    <w:name w:val="toc 1"/>
+    <w:basedOn w:val="Normal"/>
+    <w:next w:val="Normal"/>
+    <w:autoRedefine/>
+    <w:uiPriority w:val="39"/>
+    <w:unhideWhenUsed/>
+    <w:rsid w:val="00034951"/>
+    <w:pPr>
+      <w:spacing w:after="100"/>
+    </w:pPr>
+  </w:style>
+  <w:style w:type="paragraph" w:styleId="TM2">
+    <w:name w:val="toc 2"/>
+    <w:basedOn w:val="Normal"/>
+    <w:next w:val="Normal"/>
+    <w:autoRedefine/>
+    <w:uiPriority w:val="39"/>
+    <w:unhideWhenUsed/>
+    <w:rsid w:val="00034951"/>
+    <w:pPr>
+      <w:spacing w:after="100"/>
+      <w:ind w:left="240"/>
+    </w:pPr>
+  </w:style>
+  <w:style w:type="paragraph" w:styleId="TM3">
+    <w:name w:val="toc 3"/>
+    <w:basedOn w:val="Normal"/>
+    <w:next w:val="Normal"/>
+    <w:autoRedefine/>
+    <w:uiPriority w:val="39"/>
+    <w:unhideWhenUsed/>
+    <w:rsid w:val="00034951"/>
+    <w:pPr>
+      <w:spacing w:after="100"/>
+      <w:ind w:left="480"/>
+    </w:pPr>
+  </w:style>
+  <w:style w:type="character" w:styleId="Lienhypertexte">
+    <w:name w:val="Hyperlink"/>
+    <w:basedOn w:val="Policepardfaut"/>
+    <w:uiPriority w:val="99"/>
+    <w:unhideWhenUsed/>
+    <w:rsid w:val="00034951"/>
+    <w:rPr>
+      <w:color w:val="0563C1" w:themeColor="hyperlink"/>
+      <w:u w:val="single"/>
+    </w:rPr>
+  </w:style>
 </w:styles>
 </file>
 
@@ -3330,4 +5485,16 @@
     </a:ext>
   </a:extLst>
 </a:theme>
+</file>
+
+<file path=customXml/item1.xml><?xml version="1.0" encoding="utf-8"?>
+<b:Sources xmlns:b="http://schemas.openxmlformats.org/officeDocument/2006/bibliography" xmlns="http://schemas.openxmlformats.org/officeDocument/2006/bibliography" SelectedStyle="\APASixthEditionOfficeOnline.xsl" StyleName="APA" Version="6"/>
+</file>
+
+<file path=customXml/itemProps1.xml><?xml version="1.0" encoding="utf-8"?>
+<ds:datastoreItem xmlns:ds="http://schemas.openxmlformats.org/officeDocument/2006/customXml" ds:itemID="{9E8BC488-89F9-455F-ACA5-FB72C06799B9}">
+  <ds:schemaRefs>
+    <ds:schemaRef ds:uri="http://schemas.openxmlformats.org/officeDocument/2006/bibliography"/>
+  </ds:schemaRefs>
+</ds:datastoreItem>
 </file>
</xml_diff>

<commit_message>
docs: ajout de la doc technique
</commit_message>
<xml_diff>
--- a/Doc/Doc.docx
+++ b/Doc/Doc.docx
@@ -45,7 +45,6 @@
         </w:rPr>
         <w:t xml:space="preserve"> </w:t>
       </w:r>
-      <w:proofErr w:type="spellStart"/>
       <w:r>
         <w:rPr>
           <w:sz w:val="96"/>
@@ -53,7 +52,13 @@
         </w:rPr>
         <w:t>Autopilot</w:t>
       </w:r>
-      <w:proofErr w:type="spellEnd"/>
+      <w:r>
+        <w:rPr>
+          <w:sz w:val="96"/>
+          <w:szCs w:val="96"/>
+        </w:rPr>
+        <w:t>e</w:t>
+      </w:r>
     </w:p>
     <w:p/>
     <w:p>
@@ -81,7 +86,13 @@
     <w:sdt>
       <w:sdtPr>
         <w:rPr>
-          <w:lang w:val="fr-FR"/>
+          <w:rFonts w:asciiTheme="minorHAnsi" w:eastAsiaTheme="minorHAnsi" w:hAnsiTheme="minorHAnsi" w:cstheme="minorBidi"/>
+          <w:color w:val="auto"/>
+          <w:kern w:val="2"/>
+          <w:sz w:val="24"/>
+          <w:szCs w:val="24"/>
+          <w:lang w:val="fr-FR" w:eastAsia="en-US"/>
+          <w14:ligatures w14:val="standardContextual"/>
         </w:rPr>
         <w:id w:val="-619916753"/>
         <w:docPartObj>
@@ -91,15 +102,8 @@
       </w:sdtPr>
       <w:sdtEndPr>
         <w:rPr>
-          <w:rFonts w:asciiTheme="minorHAnsi" w:eastAsiaTheme="minorHAnsi" w:hAnsiTheme="minorHAnsi" w:cstheme="minorBidi"/>
           <w:b/>
           <w:bCs/>
-          <w:color w:val="auto"/>
-          <w:kern w:val="2"/>
-          <w:sz w:val="24"/>
-          <w:szCs w:val="24"/>
-          <w:lang w:eastAsia="en-US"/>
-          <w14:ligatures w14:val="standardContextual"/>
         </w:rPr>
       </w:sdtEndPr>
       <w:sdtContent>
@@ -121,7 +125,9 @@
               <w:tab w:val="right" w:leader="dot" w:pos="9062"/>
             </w:tabs>
             <w:rPr>
+              <w:rFonts w:eastAsiaTheme="minorEastAsia"/>
               <w:noProof/>
+              <w:lang w:eastAsia="fr-CH"/>
             </w:rPr>
           </w:pPr>
           <w:r>
@@ -133,7 +139,7 @@
           <w:r>
             <w:fldChar w:fldCharType="separate"/>
           </w:r>
-          <w:hyperlink w:anchor="_Toc220499868" w:history="1">
+          <w:hyperlink w:anchor="_Toc220681518" w:history="1">
             <w:r>
               <w:rPr>
                 <w:rStyle w:val="Lienhypertexte"/>
@@ -160,7 +166,7 @@
                 <w:noProof/>
                 <w:webHidden/>
               </w:rPr>
-              <w:instrText xml:space="preserve"> PAGEREF _Toc220499868 \h </w:instrText>
+              <w:instrText xml:space="preserve"> PAGEREF _Toc220681518 \h </w:instrText>
             </w:r>
             <w:r>
               <w:rPr>
@@ -198,10 +204,12 @@
               <w:tab w:val="right" w:leader="dot" w:pos="9062"/>
             </w:tabs>
             <w:rPr>
+              <w:rFonts w:eastAsiaTheme="minorEastAsia"/>
               <w:noProof/>
+              <w:lang w:eastAsia="fr-CH"/>
             </w:rPr>
           </w:pPr>
-          <w:hyperlink w:anchor="_Toc220499869" w:history="1">
+          <w:hyperlink w:anchor="_Toc220681519" w:history="1">
             <w:r>
               <w:rPr>
                 <w:rStyle w:val="Lienhypertexte"/>
@@ -228,7 +236,7 @@
                 <w:noProof/>
                 <w:webHidden/>
               </w:rPr>
-              <w:instrText xml:space="preserve"> PAGEREF _Toc220499869 \h </w:instrText>
+              <w:instrText xml:space="preserve"> PAGEREF _Toc220681519 \h </w:instrText>
             </w:r>
             <w:r>
               <w:rPr>
@@ -266,10 +274,12 @@
               <w:tab w:val="right" w:leader="dot" w:pos="9062"/>
             </w:tabs>
             <w:rPr>
+              <w:rFonts w:eastAsiaTheme="minorEastAsia"/>
               <w:noProof/>
+              <w:lang w:eastAsia="fr-CH"/>
             </w:rPr>
           </w:pPr>
-          <w:hyperlink w:anchor="_Toc220499870" w:history="1">
+          <w:hyperlink w:anchor="_Toc220681520" w:history="1">
             <w:r>
               <w:rPr>
                 <w:rStyle w:val="Lienhypertexte"/>
@@ -296,7 +306,7 @@
                 <w:noProof/>
                 <w:webHidden/>
               </w:rPr>
-              <w:instrText xml:space="preserve"> PAGEREF _Toc220499870 \h </w:instrText>
+              <w:instrText xml:space="preserve"> PAGEREF _Toc220681520 \h </w:instrText>
             </w:r>
             <w:r>
               <w:rPr>
@@ -334,10 +344,12 @@
               <w:tab w:val="right" w:leader="dot" w:pos="9062"/>
             </w:tabs>
             <w:rPr>
+              <w:rFonts w:eastAsiaTheme="minorEastAsia"/>
               <w:noProof/>
+              <w:lang w:eastAsia="fr-CH"/>
             </w:rPr>
           </w:pPr>
-          <w:hyperlink w:anchor="_Toc220499871" w:history="1">
+          <w:hyperlink w:anchor="_Toc220681521" w:history="1">
             <w:r>
               <w:rPr>
                 <w:rStyle w:val="Lienhypertexte"/>
@@ -364,7 +376,7 @@
                 <w:noProof/>
                 <w:webHidden/>
               </w:rPr>
-              <w:instrText xml:space="preserve"> PAGEREF _Toc220499871 \h </w:instrText>
+              <w:instrText xml:space="preserve"> PAGEREF _Toc220681521 \h </w:instrText>
             </w:r>
             <w:r>
               <w:rPr>
@@ -402,10 +414,12 @@
               <w:tab w:val="right" w:leader="dot" w:pos="9062"/>
             </w:tabs>
             <w:rPr>
+              <w:rFonts w:eastAsiaTheme="minorEastAsia"/>
               <w:noProof/>
+              <w:lang w:eastAsia="fr-CH"/>
             </w:rPr>
           </w:pPr>
-          <w:hyperlink w:anchor="_Toc220499872" w:history="1">
+          <w:hyperlink w:anchor="_Toc220681522" w:history="1">
             <w:r>
               <w:rPr>
                 <w:rStyle w:val="Lienhypertexte"/>
@@ -432,7 +446,7 @@
                 <w:noProof/>
                 <w:webHidden/>
               </w:rPr>
-              <w:instrText xml:space="preserve"> PAGEREF _Toc220499872 \h </w:instrText>
+              <w:instrText xml:space="preserve"> PAGEREF _Toc220681522 \h </w:instrText>
             </w:r>
             <w:r>
               <w:rPr>
@@ -470,10 +484,12 @@
               <w:tab w:val="right" w:leader="dot" w:pos="9062"/>
             </w:tabs>
             <w:rPr>
+              <w:rFonts w:eastAsiaTheme="minorEastAsia"/>
               <w:noProof/>
+              <w:lang w:eastAsia="fr-CH"/>
             </w:rPr>
           </w:pPr>
-          <w:hyperlink w:anchor="_Toc220499873" w:history="1">
+          <w:hyperlink w:anchor="_Toc220681523" w:history="1">
             <w:r>
               <w:rPr>
                 <w:rStyle w:val="Lienhypertexte"/>
@@ -500,7 +516,7 @@
                 <w:noProof/>
                 <w:webHidden/>
               </w:rPr>
-              <w:instrText xml:space="preserve"> PAGEREF _Toc220499873 \h </w:instrText>
+              <w:instrText xml:space="preserve"> PAGEREF _Toc220681523 \h </w:instrText>
             </w:r>
             <w:r>
               <w:rPr>
@@ -538,10 +554,12 @@
               <w:tab w:val="right" w:leader="dot" w:pos="9062"/>
             </w:tabs>
             <w:rPr>
+              <w:rFonts w:eastAsiaTheme="minorEastAsia"/>
               <w:noProof/>
+              <w:lang w:eastAsia="fr-CH"/>
             </w:rPr>
           </w:pPr>
-          <w:hyperlink w:anchor="_Toc220499874" w:history="1">
+          <w:hyperlink w:anchor="_Toc220681524" w:history="1">
             <w:r>
               <w:rPr>
                 <w:rStyle w:val="Lienhypertexte"/>
@@ -568,7 +586,7 @@
                 <w:noProof/>
                 <w:webHidden/>
               </w:rPr>
-              <w:instrText xml:space="preserve"> PAGEREF _Toc220499874 \h </w:instrText>
+              <w:instrText xml:space="preserve"> PAGEREF _Toc220681524 \h </w:instrText>
             </w:r>
             <w:r>
               <w:rPr>
@@ -606,10 +624,12 @@
               <w:tab w:val="right" w:leader="dot" w:pos="9062"/>
             </w:tabs>
             <w:rPr>
+              <w:rFonts w:eastAsiaTheme="minorEastAsia"/>
               <w:noProof/>
+              <w:lang w:eastAsia="fr-CH"/>
             </w:rPr>
           </w:pPr>
-          <w:hyperlink w:anchor="_Toc220499875" w:history="1">
+          <w:hyperlink w:anchor="_Toc220681525" w:history="1">
             <w:r>
               <w:rPr>
                 <w:rStyle w:val="Lienhypertexte"/>
@@ -636,7 +656,7 @@
                 <w:noProof/>
                 <w:webHidden/>
               </w:rPr>
-              <w:instrText xml:space="preserve"> PAGEREF _Toc220499875 \h </w:instrText>
+              <w:instrText xml:space="preserve"> PAGEREF _Toc220681525 \h </w:instrText>
             </w:r>
             <w:r>
               <w:rPr>
@@ -674,10 +694,12 @@
               <w:tab w:val="right" w:leader="dot" w:pos="9062"/>
             </w:tabs>
             <w:rPr>
+              <w:rFonts w:eastAsiaTheme="minorEastAsia"/>
               <w:noProof/>
+              <w:lang w:eastAsia="fr-CH"/>
             </w:rPr>
           </w:pPr>
-          <w:hyperlink w:anchor="_Toc220499876" w:history="1">
+          <w:hyperlink w:anchor="_Toc220681526" w:history="1">
             <w:r>
               <w:rPr>
                 <w:rStyle w:val="Lienhypertexte"/>
@@ -704,7 +726,7 @@
                 <w:noProof/>
                 <w:webHidden/>
               </w:rPr>
-              <w:instrText xml:space="preserve"> PAGEREF _Toc220499876 \h </w:instrText>
+              <w:instrText xml:space="preserve"> PAGEREF _Toc220681526 \h </w:instrText>
             </w:r>
             <w:r>
               <w:rPr>
@@ -742,10 +764,12 @@
               <w:tab w:val="right" w:leader="dot" w:pos="9062"/>
             </w:tabs>
             <w:rPr>
+              <w:rFonts w:eastAsiaTheme="minorEastAsia"/>
               <w:noProof/>
+              <w:lang w:eastAsia="fr-CH"/>
             </w:rPr>
           </w:pPr>
-          <w:hyperlink w:anchor="_Toc220499877" w:history="1">
+          <w:hyperlink w:anchor="_Toc220681527" w:history="1">
             <w:r>
               <w:rPr>
                 <w:rStyle w:val="Lienhypertexte"/>
@@ -772,7 +796,7 @@
                 <w:noProof/>
                 <w:webHidden/>
               </w:rPr>
-              <w:instrText xml:space="preserve"> PAGEREF _Toc220499877 \h </w:instrText>
+              <w:instrText xml:space="preserve"> PAGEREF _Toc220681527 \h </w:instrText>
             </w:r>
             <w:r>
               <w:rPr>
@@ -810,10 +834,12 @@
               <w:tab w:val="right" w:leader="dot" w:pos="9062"/>
             </w:tabs>
             <w:rPr>
+              <w:rFonts w:eastAsiaTheme="minorEastAsia"/>
               <w:noProof/>
+              <w:lang w:eastAsia="fr-CH"/>
             </w:rPr>
           </w:pPr>
-          <w:hyperlink w:anchor="_Toc220499878" w:history="1">
+          <w:hyperlink w:anchor="_Toc220681528" w:history="1">
             <w:r>
               <w:rPr>
                 <w:rStyle w:val="Lienhypertexte"/>
@@ -840,7 +866,7 @@
                 <w:noProof/>
                 <w:webHidden/>
               </w:rPr>
-              <w:instrText xml:space="preserve"> PAGEREF _Toc220499878 \h </w:instrText>
+              <w:instrText xml:space="preserve"> PAGEREF _Toc220681528 \h </w:instrText>
             </w:r>
             <w:r>
               <w:rPr>
@@ -878,10 +904,12 @@
               <w:tab w:val="right" w:leader="dot" w:pos="9062"/>
             </w:tabs>
             <w:rPr>
+              <w:rFonts w:eastAsiaTheme="minorEastAsia"/>
               <w:noProof/>
+              <w:lang w:eastAsia="fr-CH"/>
             </w:rPr>
           </w:pPr>
-          <w:hyperlink w:anchor="_Toc220499879" w:history="1">
+          <w:hyperlink w:anchor="_Toc220681529" w:history="1">
             <w:r>
               <w:rPr>
                 <w:rStyle w:val="Lienhypertexte"/>
@@ -908,7 +936,7 @@
                 <w:noProof/>
                 <w:webHidden/>
               </w:rPr>
-              <w:instrText xml:space="preserve"> PAGEREF _Toc220499879 \h </w:instrText>
+              <w:instrText xml:space="preserve"> PAGEREF _Toc220681529 \h </w:instrText>
             </w:r>
             <w:r>
               <w:rPr>
@@ -946,10 +974,12 @@
               <w:tab w:val="right" w:leader="dot" w:pos="9062"/>
             </w:tabs>
             <w:rPr>
+              <w:rFonts w:eastAsiaTheme="minorEastAsia"/>
               <w:noProof/>
+              <w:lang w:eastAsia="fr-CH"/>
             </w:rPr>
           </w:pPr>
-          <w:hyperlink w:anchor="_Toc220499880" w:history="1">
+          <w:hyperlink w:anchor="_Toc220681530" w:history="1">
             <w:r>
               <w:rPr>
                 <w:rStyle w:val="Lienhypertexte"/>
@@ -976,7 +1006,7 @@
                 <w:noProof/>
                 <w:webHidden/>
               </w:rPr>
-              <w:instrText xml:space="preserve"> PAGEREF _Toc220499880 \h </w:instrText>
+              <w:instrText xml:space="preserve"> PAGEREF _Toc220681530 \h </w:instrText>
             </w:r>
             <w:r>
               <w:rPr>
@@ -1014,15 +1044,87 @@
               <w:tab w:val="right" w:leader="dot" w:pos="9062"/>
             </w:tabs>
             <w:rPr>
+              <w:rFonts w:eastAsiaTheme="minorEastAsia"/>
               <w:noProof/>
+              <w:lang w:eastAsia="fr-CH"/>
             </w:rPr>
           </w:pPr>
-          <w:hyperlink w:anchor="_Toc220499881" w:history="1">
+          <w:hyperlink w:anchor="_Toc220681531" w:history="1">
             <w:r>
               <w:rPr>
                 <w:rStyle w:val="Lienhypertexte"/>
                 <w:noProof/>
               </w:rPr>
+              <w:t>Fonctionnement :</w:t>
+            </w:r>
+            <w:r>
+              <w:rPr>
+                <w:noProof/>
+                <w:webHidden/>
+              </w:rPr>
+              <w:tab/>
+            </w:r>
+            <w:r>
+              <w:rPr>
+                <w:noProof/>
+                <w:webHidden/>
+              </w:rPr>
+              <w:fldChar w:fldCharType="begin"/>
+            </w:r>
+            <w:r>
+              <w:rPr>
+                <w:noProof/>
+                <w:webHidden/>
+              </w:rPr>
+              <w:instrText xml:space="preserve"> PAGEREF _Toc220681531 \h </w:instrText>
+            </w:r>
+            <w:r>
+              <w:rPr>
+                <w:noProof/>
+                <w:webHidden/>
+              </w:rPr>
+            </w:r>
+            <w:r>
+              <w:rPr>
+                <w:noProof/>
+                <w:webHidden/>
+              </w:rPr>
+              <w:fldChar w:fldCharType="separate"/>
+            </w:r>
+            <w:r>
+              <w:rPr>
+                <w:noProof/>
+                <w:webHidden/>
+              </w:rPr>
+              <w:t>6</w:t>
+            </w:r>
+            <w:r>
+              <w:rPr>
+                <w:noProof/>
+                <w:webHidden/>
+              </w:rPr>
+              <w:fldChar w:fldCharType="end"/>
+            </w:r>
+          </w:hyperlink>
+        </w:p>
+        <w:p>
+          <w:pPr>
+            <w:pStyle w:val="TM2"/>
+            <w:tabs>
+              <w:tab w:val="right" w:leader="dot" w:pos="9062"/>
+            </w:tabs>
+            <w:rPr>
+              <w:rFonts w:eastAsiaTheme="minorEastAsia"/>
+              <w:noProof/>
+              <w:lang w:eastAsia="fr-CH"/>
+            </w:rPr>
+          </w:pPr>
+          <w:hyperlink w:anchor="_Toc220681532" w:history="1">
+            <w:r>
+              <w:rPr>
+                <w:rStyle w:val="Lienhypertexte"/>
+                <w:noProof/>
+              </w:rPr>
               <w:t>Correction théorique :</w:t>
             </w:r>
             <w:r>
@@ -1044,7 +1146,7 @@
                 <w:noProof/>
                 <w:webHidden/>
               </w:rPr>
-              <w:instrText xml:space="preserve"> PAGEREF _Toc220499881 \h </w:instrText>
+              <w:instrText xml:space="preserve"> PAGEREF _Toc220681532 \h </w:instrText>
             </w:r>
             <w:r>
               <w:rPr>
@@ -1064,7 +1166,1057 @@
                 <w:noProof/>
                 <w:webHidden/>
               </w:rPr>
-              <w:t>6</w:t>
+              <w:t>8</w:t>
+            </w:r>
+            <w:r>
+              <w:rPr>
+                <w:noProof/>
+                <w:webHidden/>
+              </w:rPr>
+              <w:fldChar w:fldCharType="end"/>
+            </w:r>
+          </w:hyperlink>
+        </w:p>
+        <w:p>
+          <w:pPr>
+            <w:pStyle w:val="TM1"/>
+            <w:tabs>
+              <w:tab w:val="right" w:leader="dot" w:pos="9062"/>
+            </w:tabs>
+            <w:rPr>
+              <w:rFonts w:eastAsiaTheme="minorEastAsia"/>
+              <w:noProof/>
+              <w:lang w:eastAsia="fr-CH"/>
+            </w:rPr>
+          </w:pPr>
+          <w:hyperlink w:anchor="_Toc220681533" w:history="1">
+            <w:r>
+              <w:rPr>
+                <w:rStyle w:val="Lienhypertexte"/>
+                <w:noProof/>
+              </w:rPr>
+              <w:t>Ajout d’un mode de vol en cercle complet</w:t>
+            </w:r>
+            <w:r>
+              <w:rPr>
+                <w:noProof/>
+                <w:webHidden/>
+              </w:rPr>
+              <w:tab/>
+            </w:r>
+            <w:r>
+              <w:rPr>
+                <w:noProof/>
+                <w:webHidden/>
+              </w:rPr>
+              <w:fldChar w:fldCharType="begin"/>
+            </w:r>
+            <w:r>
+              <w:rPr>
+                <w:noProof/>
+                <w:webHidden/>
+              </w:rPr>
+              <w:instrText xml:space="preserve"> PAGEREF _Toc220681533 \h </w:instrText>
+            </w:r>
+            <w:r>
+              <w:rPr>
+                <w:noProof/>
+                <w:webHidden/>
+              </w:rPr>
+            </w:r>
+            <w:r>
+              <w:rPr>
+                <w:noProof/>
+                <w:webHidden/>
+              </w:rPr>
+              <w:fldChar w:fldCharType="separate"/>
+            </w:r>
+            <w:r>
+              <w:rPr>
+                <w:noProof/>
+                <w:webHidden/>
+              </w:rPr>
+              <w:t>9</w:t>
+            </w:r>
+            <w:r>
+              <w:rPr>
+                <w:noProof/>
+                <w:webHidden/>
+              </w:rPr>
+              <w:fldChar w:fldCharType="end"/>
+            </w:r>
+          </w:hyperlink>
+        </w:p>
+        <w:p>
+          <w:pPr>
+            <w:pStyle w:val="TM2"/>
+            <w:tabs>
+              <w:tab w:val="right" w:leader="dot" w:pos="9062"/>
+            </w:tabs>
+            <w:rPr>
+              <w:rFonts w:eastAsiaTheme="minorEastAsia"/>
+              <w:noProof/>
+              <w:lang w:eastAsia="fr-CH"/>
+            </w:rPr>
+          </w:pPr>
+          <w:hyperlink w:anchor="_Toc220681534" w:history="1">
+            <w:r>
+              <w:rPr>
+                <w:rStyle w:val="Lienhypertexte"/>
+                <w:noProof/>
+              </w:rPr>
+              <w:t>Objectif général</w:t>
+            </w:r>
+            <w:r>
+              <w:rPr>
+                <w:noProof/>
+                <w:webHidden/>
+              </w:rPr>
+              <w:tab/>
+            </w:r>
+            <w:r>
+              <w:rPr>
+                <w:noProof/>
+                <w:webHidden/>
+              </w:rPr>
+              <w:fldChar w:fldCharType="begin"/>
+            </w:r>
+            <w:r>
+              <w:rPr>
+                <w:noProof/>
+                <w:webHidden/>
+              </w:rPr>
+              <w:instrText xml:space="preserve"> PAGEREF _Toc220681534 \h </w:instrText>
+            </w:r>
+            <w:r>
+              <w:rPr>
+                <w:noProof/>
+                <w:webHidden/>
+              </w:rPr>
+            </w:r>
+            <w:r>
+              <w:rPr>
+                <w:noProof/>
+                <w:webHidden/>
+              </w:rPr>
+              <w:fldChar w:fldCharType="separate"/>
+            </w:r>
+            <w:r>
+              <w:rPr>
+                <w:noProof/>
+                <w:webHidden/>
+              </w:rPr>
+              <w:t>9</w:t>
+            </w:r>
+            <w:r>
+              <w:rPr>
+                <w:noProof/>
+                <w:webHidden/>
+              </w:rPr>
+              <w:fldChar w:fldCharType="end"/>
+            </w:r>
+          </w:hyperlink>
+        </w:p>
+        <w:p>
+          <w:pPr>
+            <w:pStyle w:val="TM2"/>
+            <w:tabs>
+              <w:tab w:val="right" w:leader="dot" w:pos="9062"/>
+            </w:tabs>
+            <w:rPr>
+              <w:rFonts w:eastAsiaTheme="minorEastAsia"/>
+              <w:noProof/>
+              <w:lang w:eastAsia="fr-CH"/>
+            </w:rPr>
+          </w:pPr>
+          <w:hyperlink w:anchor="_Toc220681535" w:history="1">
+            <w:r>
+              <w:rPr>
+                <w:rStyle w:val="Lienhypertexte"/>
+                <w:noProof/>
+              </w:rPr>
+              <w:t>Valeurs récupérées (Get)</w:t>
+            </w:r>
+            <w:r>
+              <w:rPr>
+                <w:noProof/>
+                <w:webHidden/>
+              </w:rPr>
+              <w:tab/>
+            </w:r>
+            <w:r>
+              <w:rPr>
+                <w:noProof/>
+                <w:webHidden/>
+              </w:rPr>
+              <w:fldChar w:fldCharType="begin"/>
+            </w:r>
+            <w:r>
+              <w:rPr>
+                <w:noProof/>
+                <w:webHidden/>
+              </w:rPr>
+              <w:instrText xml:space="preserve"> PAGEREF _Toc220681535 \h </w:instrText>
+            </w:r>
+            <w:r>
+              <w:rPr>
+                <w:noProof/>
+                <w:webHidden/>
+              </w:rPr>
+            </w:r>
+            <w:r>
+              <w:rPr>
+                <w:noProof/>
+                <w:webHidden/>
+              </w:rPr>
+              <w:fldChar w:fldCharType="separate"/>
+            </w:r>
+            <w:r>
+              <w:rPr>
+                <w:noProof/>
+                <w:webHidden/>
+              </w:rPr>
+              <w:t>9</w:t>
+            </w:r>
+            <w:r>
+              <w:rPr>
+                <w:noProof/>
+                <w:webHidden/>
+              </w:rPr>
+              <w:fldChar w:fldCharType="end"/>
+            </w:r>
+          </w:hyperlink>
+        </w:p>
+        <w:p>
+          <w:pPr>
+            <w:pStyle w:val="TM2"/>
+            <w:tabs>
+              <w:tab w:val="right" w:leader="dot" w:pos="9062"/>
+            </w:tabs>
+            <w:rPr>
+              <w:rFonts w:eastAsiaTheme="minorEastAsia"/>
+              <w:noProof/>
+              <w:lang w:eastAsia="fr-CH"/>
+            </w:rPr>
+          </w:pPr>
+          <w:hyperlink w:anchor="_Toc220681536" w:history="1">
+            <w:r>
+              <w:rPr>
+                <w:rStyle w:val="Lienhypertexte"/>
+                <w:noProof/>
+              </w:rPr>
+              <w:t>Valeur définie (Set)</w:t>
+            </w:r>
+            <w:r>
+              <w:rPr>
+                <w:noProof/>
+                <w:webHidden/>
+              </w:rPr>
+              <w:tab/>
+            </w:r>
+            <w:r>
+              <w:rPr>
+                <w:noProof/>
+                <w:webHidden/>
+              </w:rPr>
+              <w:fldChar w:fldCharType="begin"/>
+            </w:r>
+            <w:r>
+              <w:rPr>
+                <w:noProof/>
+                <w:webHidden/>
+              </w:rPr>
+              <w:instrText xml:space="preserve"> PAGEREF _Toc220681536 \h </w:instrText>
+            </w:r>
+            <w:r>
+              <w:rPr>
+                <w:noProof/>
+                <w:webHidden/>
+              </w:rPr>
+            </w:r>
+            <w:r>
+              <w:rPr>
+                <w:noProof/>
+                <w:webHidden/>
+              </w:rPr>
+              <w:fldChar w:fldCharType="separate"/>
+            </w:r>
+            <w:r>
+              <w:rPr>
+                <w:noProof/>
+                <w:webHidden/>
+              </w:rPr>
+              <w:t>9</w:t>
+            </w:r>
+            <w:r>
+              <w:rPr>
+                <w:noProof/>
+                <w:webHidden/>
+              </w:rPr>
+              <w:fldChar w:fldCharType="end"/>
+            </w:r>
+          </w:hyperlink>
+        </w:p>
+        <w:p>
+          <w:pPr>
+            <w:pStyle w:val="TM2"/>
+            <w:tabs>
+              <w:tab w:val="right" w:leader="dot" w:pos="9062"/>
+            </w:tabs>
+            <w:rPr>
+              <w:rFonts w:eastAsiaTheme="minorEastAsia"/>
+              <w:noProof/>
+              <w:lang w:eastAsia="fr-CH"/>
+            </w:rPr>
+          </w:pPr>
+          <w:hyperlink w:anchor="_Toc220681537" w:history="1">
+            <w:r>
+              <w:rPr>
+                <w:rStyle w:val="Lienhypertexte"/>
+                <w:noProof/>
+              </w:rPr>
+              <w:t>Déclenchement du cercle</w:t>
+            </w:r>
+            <w:r>
+              <w:rPr>
+                <w:noProof/>
+                <w:webHidden/>
+              </w:rPr>
+              <w:tab/>
+            </w:r>
+            <w:r>
+              <w:rPr>
+                <w:noProof/>
+                <w:webHidden/>
+              </w:rPr>
+              <w:fldChar w:fldCharType="begin"/>
+            </w:r>
+            <w:r>
+              <w:rPr>
+                <w:noProof/>
+                <w:webHidden/>
+              </w:rPr>
+              <w:instrText xml:space="preserve"> PAGEREF _Toc220681537 \h </w:instrText>
+            </w:r>
+            <w:r>
+              <w:rPr>
+                <w:noProof/>
+                <w:webHidden/>
+              </w:rPr>
+            </w:r>
+            <w:r>
+              <w:rPr>
+                <w:noProof/>
+                <w:webHidden/>
+              </w:rPr>
+              <w:fldChar w:fldCharType="separate"/>
+            </w:r>
+            <w:r>
+              <w:rPr>
+                <w:noProof/>
+                <w:webHidden/>
+              </w:rPr>
+              <w:t>9</w:t>
+            </w:r>
+            <w:r>
+              <w:rPr>
+                <w:noProof/>
+                <w:webHidden/>
+              </w:rPr>
+              <w:fldChar w:fldCharType="end"/>
+            </w:r>
+          </w:hyperlink>
+        </w:p>
+        <w:p>
+          <w:pPr>
+            <w:pStyle w:val="TM2"/>
+            <w:tabs>
+              <w:tab w:val="right" w:leader="dot" w:pos="9062"/>
+            </w:tabs>
+            <w:rPr>
+              <w:rFonts w:eastAsiaTheme="minorEastAsia"/>
+              <w:noProof/>
+              <w:lang w:eastAsia="fr-CH"/>
+            </w:rPr>
+          </w:pPr>
+          <w:hyperlink w:anchor="_Toc220681538" w:history="1">
+            <w:r>
+              <w:rPr>
+                <w:rStyle w:val="Lienhypertexte"/>
+                <w:noProof/>
+              </w:rPr>
+              <w:t>Mémorisation du cap de départ</w:t>
+            </w:r>
+            <w:r>
+              <w:rPr>
+                <w:noProof/>
+                <w:webHidden/>
+              </w:rPr>
+              <w:tab/>
+            </w:r>
+            <w:r>
+              <w:rPr>
+                <w:noProof/>
+                <w:webHidden/>
+              </w:rPr>
+              <w:fldChar w:fldCharType="begin"/>
+            </w:r>
+            <w:r>
+              <w:rPr>
+                <w:noProof/>
+                <w:webHidden/>
+              </w:rPr>
+              <w:instrText xml:space="preserve"> PAGEREF _Toc220681538 \h </w:instrText>
+            </w:r>
+            <w:r>
+              <w:rPr>
+                <w:noProof/>
+                <w:webHidden/>
+              </w:rPr>
+            </w:r>
+            <w:r>
+              <w:rPr>
+                <w:noProof/>
+                <w:webHidden/>
+              </w:rPr>
+              <w:fldChar w:fldCharType="separate"/>
+            </w:r>
+            <w:r>
+              <w:rPr>
+                <w:noProof/>
+                <w:webHidden/>
+              </w:rPr>
+              <w:t>9</w:t>
+            </w:r>
+            <w:r>
+              <w:rPr>
+                <w:noProof/>
+                <w:webHidden/>
+              </w:rPr>
+              <w:fldChar w:fldCharType="end"/>
+            </w:r>
+          </w:hyperlink>
+        </w:p>
+        <w:p>
+          <w:pPr>
+            <w:pStyle w:val="TM2"/>
+            <w:tabs>
+              <w:tab w:val="right" w:leader="dot" w:pos="9062"/>
+            </w:tabs>
+            <w:rPr>
+              <w:rFonts w:eastAsiaTheme="minorEastAsia"/>
+              <w:noProof/>
+              <w:lang w:eastAsia="fr-CH"/>
+            </w:rPr>
+          </w:pPr>
+          <w:hyperlink w:anchor="_Toc220681539" w:history="1">
+            <w:r>
+              <w:rPr>
+                <w:rStyle w:val="Lienhypertexte"/>
+                <w:noProof/>
+              </w:rPr>
+              <w:t>Logique du virage</w:t>
+            </w:r>
+            <w:r>
+              <w:rPr>
+                <w:noProof/>
+                <w:webHidden/>
+              </w:rPr>
+              <w:tab/>
+            </w:r>
+            <w:r>
+              <w:rPr>
+                <w:noProof/>
+                <w:webHidden/>
+              </w:rPr>
+              <w:fldChar w:fldCharType="begin"/>
+            </w:r>
+            <w:r>
+              <w:rPr>
+                <w:noProof/>
+                <w:webHidden/>
+              </w:rPr>
+              <w:instrText xml:space="preserve"> PAGEREF _Toc220681539 \h </w:instrText>
+            </w:r>
+            <w:r>
+              <w:rPr>
+                <w:noProof/>
+                <w:webHidden/>
+              </w:rPr>
+            </w:r>
+            <w:r>
+              <w:rPr>
+                <w:noProof/>
+                <w:webHidden/>
+              </w:rPr>
+              <w:fldChar w:fldCharType="separate"/>
+            </w:r>
+            <w:r>
+              <w:rPr>
+                <w:noProof/>
+                <w:webHidden/>
+              </w:rPr>
+              <w:t>10</w:t>
+            </w:r>
+            <w:r>
+              <w:rPr>
+                <w:noProof/>
+                <w:webHidden/>
+              </w:rPr>
+              <w:fldChar w:fldCharType="end"/>
+            </w:r>
+          </w:hyperlink>
+        </w:p>
+        <w:p>
+          <w:pPr>
+            <w:pStyle w:val="TM2"/>
+            <w:tabs>
+              <w:tab w:val="right" w:leader="dot" w:pos="9062"/>
+            </w:tabs>
+            <w:rPr>
+              <w:rFonts w:eastAsiaTheme="minorEastAsia"/>
+              <w:noProof/>
+              <w:lang w:eastAsia="fr-CH"/>
+            </w:rPr>
+          </w:pPr>
+          <w:hyperlink w:anchor="_Toc220681540" w:history="1">
+            <w:r>
+              <w:rPr>
+                <w:rStyle w:val="Lienhypertexte"/>
+                <w:noProof/>
+              </w:rPr>
+              <w:t>Détection du cercle complet</w:t>
+            </w:r>
+            <w:r>
+              <w:rPr>
+                <w:noProof/>
+                <w:webHidden/>
+              </w:rPr>
+              <w:tab/>
+            </w:r>
+            <w:r>
+              <w:rPr>
+                <w:noProof/>
+                <w:webHidden/>
+              </w:rPr>
+              <w:fldChar w:fldCharType="begin"/>
+            </w:r>
+            <w:r>
+              <w:rPr>
+                <w:noProof/>
+                <w:webHidden/>
+              </w:rPr>
+              <w:instrText xml:space="preserve"> PAGEREF _Toc220681540 \h </w:instrText>
+            </w:r>
+            <w:r>
+              <w:rPr>
+                <w:noProof/>
+                <w:webHidden/>
+              </w:rPr>
+            </w:r>
+            <w:r>
+              <w:rPr>
+                <w:noProof/>
+                <w:webHidden/>
+              </w:rPr>
+              <w:fldChar w:fldCharType="separate"/>
+            </w:r>
+            <w:r>
+              <w:rPr>
+                <w:noProof/>
+                <w:webHidden/>
+              </w:rPr>
+              <w:t>10</w:t>
+            </w:r>
+            <w:r>
+              <w:rPr>
+                <w:noProof/>
+                <w:webHidden/>
+              </w:rPr>
+              <w:fldChar w:fldCharType="end"/>
+            </w:r>
+          </w:hyperlink>
+        </w:p>
+        <w:p>
+          <w:pPr>
+            <w:pStyle w:val="TM3"/>
+            <w:tabs>
+              <w:tab w:val="right" w:leader="dot" w:pos="9062"/>
+            </w:tabs>
+            <w:rPr>
+              <w:rFonts w:eastAsiaTheme="minorEastAsia"/>
+              <w:noProof/>
+              <w:lang w:eastAsia="fr-CH"/>
+            </w:rPr>
+          </w:pPr>
+          <w:hyperlink w:anchor="_Toc220681541" w:history="1">
+            <w:r>
+              <w:rPr>
+                <w:rStyle w:val="Lienhypertexte"/>
+                <w:noProof/>
+              </w:rPr>
+              <w:t>Problème des angles 0 / 360</w:t>
+            </w:r>
+            <w:r>
+              <w:rPr>
+                <w:noProof/>
+                <w:webHidden/>
+              </w:rPr>
+              <w:tab/>
+            </w:r>
+            <w:r>
+              <w:rPr>
+                <w:noProof/>
+                <w:webHidden/>
+              </w:rPr>
+              <w:fldChar w:fldCharType="begin"/>
+            </w:r>
+            <w:r>
+              <w:rPr>
+                <w:noProof/>
+                <w:webHidden/>
+              </w:rPr>
+              <w:instrText xml:space="preserve"> PAGEREF _Toc220681541 \h </w:instrText>
+            </w:r>
+            <w:r>
+              <w:rPr>
+                <w:noProof/>
+                <w:webHidden/>
+              </w:rPr>
+            </w:r>
+            <w:r>
+              <w:rPr>
+                <w:noProof/>
+                <w:webHidden/>
+              </w:rPr>
+              <w:fldChar w:fldCharType="separate"/>
+            </w:r>
+            <w:r>
+              <w:rPr>
+                <w:noProof/>
+                <w:webHidden/>
+              </w:rPr>
+              <w:t>10</w:t>
+            </w:r>
+            <w:r>
+              <w:rPr>
+                <w:noProof/>
+                <w:webHidden/>
+              </w:rPr>
+              <w:fldChar w:fldCharType="end"/>
+            </w:r>
+          </w:hyperlink>
+        </w:p>
+        <w:p>
+          <w:pPr>
+            <w:pStyle w:val="TM2"/>
+            <w:tabs>
+              <w:tab w:val="right" w:leader="dot" w:pos="9062"/>
+            </w:tabs>
+            <w:rPr>
+              <w:rFonts w:eastAsiaTheme="minorEastAsia"/>
+              <w:noProof/>
+              <w:lang w:eastAsia="fr-CH"/>
+            </w:rPr>
+          </w:pPr>
+          <w:hyperlink w:anchor="_Toc220681542" w:history="1">
+            <w:r>
+              <w:rPr>
+                <w:rStyle w:val="Lienhypertexte"/>
+                <w:noProof/>
+              </w:rPr>
+              <w:t>Solution : Normalisation des angles</w:t>
+            </w:r>
+            <w:r>
+              <w:rPr>
+                <w:noProof/>
+                <w:webHidden/>
+              </w:rPr>
+              <w:tab/>
+            </w:r>
+            <w:r>
+              <w:rPr>
+                <w:noProof/>
+                <w:webHidden/>
+              </w:rPr>
+              <w:fldChar w:fldCharType="begin"/>
+            </w:r>
+            <w:r>
+              <w:rPr>
+                <w:noProof/>
+                <w:webHidden/>
+              </w:rPr>
+              <w:instrText xml:space="preserve"> PAGEREF _Toc220681542 \h </w:instrText>
+            </w:r>
+            <w:r>
+              <w:rPr>
+                <w:noProof/>
+                <w:webHidden/>
+              </w:rPr>
+            </w:r>
+            <w:r>
+              <w:rPr>
+                <w:noProof/>
+                <w:webHidden/>
+              </w:rPr>
+              <w:fldChar w:fldCharType="separate"/>
+            </w:r>
+            <w:r>
+              <w:rPr>
+                <w:noProof/>
+                <w:webHidden/>
+              </w:rPr>
+              <w:t>10</w:t>
+            </w:r>
+            <w:r>
+              <w:rPr>
+                <w:noProof/>
+                <w:webHidden/>
+              </w:rPr>
+              <w:fldChar w:fldCharType="end"/>
+            </w:r>
+          </w:hyperlink>
+        </w:p>
+        <w:p>
+          <w:pPr>
+            <w:pStyle w:val="TM2"/>
+            <w:tabs>
+              <w:tab w:val="right" w:leader="dot" w:pos="9062"/>
+            </w:tabs>
+            <w:rPr>
+              <w:rFonts w:eastAsiaTheme="minorEastAsia"/>
+              <w:noProof/>
+              <w:lang w:eastAsia="fr-CH"/>
+            </w:rPr>
+          </w:pPr>
+          <w:hyperlink w:anchor="_Toc220681543" w:history="1">
+            <w:r>
+              <w:rPr>
+                <w:rStyle w:val="Lienhypertexte"/>
+                <w:noProof/>
+              </w:rPr>
+              <w:t>Conditions de fin du cercle</w:t>
+            </w:r>
+            <w:r>
+              <w:rPr>
+                <w:noProof/>
+                <w:webHidden/>
+              </w:rPr>
+              <w:tab/>
+            </w:r>
+            <w:r>
+              <w:rPr>
+                <w:noProof/>
+                <w:webHidden/>
+              </w:rPr>
+              <w:fldChar w:fldCharType="begin"/>
+            </w:r>
+            <w:r>
+              <w:rPr>
+                <w:noProof/>
+                <w:webHidden/>
+              </w:rPr>
+              <w:instrText xml:space="preserve"> PAGEREF _Toc220681543 \h </w:instrText>
+            </w:r>
+            <w:r>
+              <w:rPr>
+                <w:noProof/>
+                <w:webHidden/>
+              </w:rPr>
+            </w:r>
+            <w:r>
+              <w:rPr>
+                <w:noProof/>
+                <w:webHidden/>
+              </w:rPr>
+              <w:fldChar w:fldCharType="separate"/>
+            </w:r>
+            <w:r>
+              <w:rPr>
+                <w:noProof/>
+                <w:webHidden/>
+              </w:rPr>
+              <w:t>11</w:t>
+            </w:r>
+            <w:r>
+              <w:rPr>
+                <w:noProof/>
+                <w:webHidden/>
+              </w:rPr>
+              <w:fldChar w:fldCharType="end"/>
+            </w:r>
+          </w:hyperlink>
+        </w:p>
+        <w:p>
+          <w:pPr>
+            <w:pStyle w:val="TM2"/>
+            <w:tabs>
+              <w:tab w:val="right" w:leader="dot" w:pos="9062"/>
+            </w:tabs>
+            <w:rPr>
+              <w:rFonts w:eastAsiaTheme="minorEastAsia"/>
+              <w:noProof/>
+              <w:lang w:eastAsia="fr-CH"/>
+            </w:rPr>
+          </w:pPr>
+          <w:hyperlink w:anchor="_Toc220681544" w:history="1">
+            <w:r>
+              <w:rPr>
+                <w:rStyle w:val="Lienhypertexte"/>
+                <w:noProof/>
+              </w:rPr>
+              <w:t>Fin du cercle</w:t>
+            </w:r>
+            <w:r>
+              <w:rPr>
+                <w:noProof/>
+                <w:webHidden/>
+              </w:rPr>
+              <w:tab/>
+            </w:r>
+            <w:r>
+              <w:rPr>
+                <w:noProof/>
+                <w:webHidden/>
+              </w:rPr>
+              <w:fldChar w:fldCharType="begin"/>
+            </w:r>
+            <w:r>
+              <w:rPr>
+                <w:noProof/>
+                <w:webHidden/>
+              </w:rPr>
+              <w:instrText xml:space="preserve"> PAGEREF _Toc220681544 \h </w:instrText>
+            </w:r>
+            <w:r>
+              <w:rPr>
+                <w:noProof/>
+                <w:webHidden/>
+              </w:rPr>
+            </w:r>
+            <w:r>
+              <w:rPr>
+                <w:noProof/>
+                <w:webHidden/>
+              </w:rPr>
+              <w:fldChar w:fldCharType="separate"/>
+            </w:r>
+            <w:r>
+              <w:rPr>
+                <w:noProof/>
+                <w:webHidden/>
+              </w:rPr>
+              <w:t>11</w:t>
+            </w:r>
+            <w:r>
+              <w:rPr>
+                <w:noProof/>
+                <w:webHidden/>
+              </w:rPr>
+              <w:fldChar w:fldCharType="end"/>
+            </w:r>
+          </w:hyperlink>
+        </w:p>
+        <w:p>
+          <w:pPr>
+            <w:pStyle w:val="TM2"/>
+            <w:tabs>
+              <w:tab w:val="right" w:leader="dot" w:pos="9062"/>
+            </w:tabs>
+            <w:rPr>
+              <w:rFonts w:eastAsiaTheme="minorEastAsia"/>
+              <w:noProof/>
+              <w:lang w:eastAsia="fr-CH"/>
+            </w:rPr>
+          </w:pPr>
+          <w:hyperlink w:anchor="_Toc220681545" w:history="1">
+            <w:r>
+              <w:rPr>
+                <w:rStyle w:val="Lienhypertexte"/>
+                <w:noProof/>
+              </w:rPr>
+              <w:t>Avantages de cette approche</w:t>
+            </w:r>
+            <w:r>
+              <w:rPr>
+                <w:noProof/>
+                <w:webHidden/>
+              </w:rPr>
+              <w:tab/>
+            </w:r>
+            <w:r>
+              <w:rPr>
+                <w:noProof/>
+                <w:webHidden/>
+              </w:rPr>
+              <w:fldChar w:fldCharType="begin"/>
+            </w:r>
+            <w:r>
+              <w:rPr>
+                <w:noProof/>
+                <w:webHidden/>
+              </w:rPr>
+              <w:instrText xml:space="preserve"> PAGEREF _Toc220681545 \h </w:instrText>
+            </w:r>
+            <w:r>
+              <w:rPr>
+                <w:noProof/>
+                <w:webHidden/>
+              </w:rPr>
+            </w:r>
+            <w:r>
+              <w:rPr>
+                <w:noProof/>
+                <w:webHidden/>
+              </w:rPr>
+              <w:fldChar w:fldCharType="separate"/>
+            </w:r>
+            <w:r>
+              <w:rPr>
+                <w:noProof/>
+                <w:webHidden/>
+              </w:rPr>
+              <w:t>11</w:t>
+            </w:r>
+            <w:r>
+              <w:rPr>
+                <w:noProof/>
+                <w:webHidden/>
+              </w:rPr>
+              <w:fldChar w:fldCharType="end"/>
+            </w:r>
+          </w:hyperlink>
+        </w:p>
+        <w:p>
+          <w:pPr>
+            <w:pStyle w:val="TM3"/>
+            <w:tabs>
+              <w:tab w:val="right" w:leader="dot" w:pos="9062"/>
+            </w:tabs>
+            <w:rPr>
+              <w:rFonts w:eastAsiaTheme="minorEastAsia"/>
+              <w:noProof/>
+              <w:lang w:eastAsia="fr-CH"/>
+            </w:rPr>
+          </w:pPr>
+          <w:hyperlink w:anchor="_Toc220681546" w:history="1">
+            <w:r>
+              <w:rPr>
+                <w:rStyle w:val="Lienhypertexte"/>
+                <w:noProof/>
+              </w:rPr>
+              <w:t>Limites et améliorations possibles</w:t>
+            </w:r>
+            <w:r>
+              <w:rPr>
+                <w:noProof/>
+                <w:webHidden/>
+              </w:rPr>
+              <w:tab/>
+            </w:r>
+            <w:r>
+              <w:rPr>
+                <w:noProof/>
+                <w:webHidden/>
+              </w:rPr>
+              <w:fldChar w:fldCharType="begin"/>
+            </w:r>
+            <w:r>
+              <w:rPr>
+                <w:noProof/>
+                <w:webHidden/>
+              </w:rPr>
+              <w:instrText xml:space="preserve"> PAGEREF _Toc220681546 \h </w:instrText>
+            </w:r>
+            <w:r>
+              <w:rPr>
+                <w:noProof/>
+                <w:webHidden/>
+              </w:rPr>
+            </w:r>
+            <w:r>
+              <w:rPr>
+                <w:noProof/>
+                <w:webHidden/>
+              </w:rPr>
+              <w:fldChar w:fldCharType="separate"/>
+            </w:r>
+            <w:r>
+              <w:rPr>
+                <w:noProof/>
+                <w:webHidden/>
+              </w:rPr>
+              <w:t>11</w:t>
+            </w:r>
+            <w:r>
+              <w:rPr>
+                <w:noProof/>
+                <w:webHidden/>
+              </w:rPr>
+              <w:fldChar w:fldCharType="end"/>
+            </w:r>
+          </w:hyperlink>
+        </w:p>
+        <w:p>
+          <w:pPr>
+            <w:pStyle w:val="TM2"/>
+            <w:tabs>
+              <w:tab w:val="right" w:leader="dot" w:pos="9062"/>
+            </w:tabs>
+            <w:rPr>
+              <w:rFonts w:eastAsiaTheme="minorEastAsia"/>
+              <w:noProof/>
+              <w:lang w:eastAsia="fr-CH"/>
+            </w:rPr>
+          </w:pPr>
+          <w:hyperlink w:anchor="_Toc220681547" w:history="1">
+            <w:r>
+              <w:rPr>
+                <w:rStyle w:val="Lienhypertexte"/>
+                <w:noProof/>
+              </w:rPr>
+              <w:t>Conclusion</w:t>
+            </w:r>
+            <w:r>
+              <w:rPr>
+                <w:noProof/>
+                <w:webHidden/>
+              </w:rPr>
+              <w:tab/>
+            </w:r>
+            <w:r>
+              <w:rPr>
+                <w:noProof/>
+                <w:webHidden/>
+              </w:rPr>
+              <w:fldChar w:fldCharType="begin"/>
+            </w:r>
+            <w:r>
+              <w:rPr>
+                <w:noProof/>
+                <w:webHidden/>
+              </w:rPr>
+              <w:instrText xml:space="preserve"> PAGEREF _Toc220681547 \h </w:instrText>
+            </w:r>
+            <w:r>
+              <w:rPr>
+                <w:noProof/>
+                <w:webHidden/>
+              </w:rPr>
+            </w:r>
+            <w:r>
+              <w:rPr>
+                <w:noProof/>
+                <w:webHidden/>
+              </w:rPr>
+              <w:fldChar w:fldCharType="separate"/>
+            </w:r>
+            <w:r>
+              <w:rPr>
+                <w:noProof/>
+                <w:webHidden/>
+              </w:rPr>
+              <w:t>12</w:t>
             </w:r>
             <w:r>
               <w:rPr>
@@ -1088,15 +2240,10 @@
       </w:sdtContent>
     </w:sdt>
     <w:p>
-      <w:r>
-        <w:br w:type="page"/>
-      </w:r>
-    </w:p>
-    <w:p>
       <w:pPr>
         <w:pStyle w:val="Titre1"/>
       </w:pPr>
-      <w:bookmarkStart w:id="0" w:name="_Toc220499868"/>
+      <w:bookmarkStart w:id="0" w:name="_Toc220681518"/>
       <w:r>
         <w:lastRenderedPageBreak/>
         <w:t>Logi</w:t>
@@ -1119,7 +2266,7 @@
       <w:pPr>
         <w:pStyle w:val="Titre2"/>
       </w:pPr>
-      <w:bookmarkStart w:id="1" w:name="_Toc220499869"/>
+      <w:bookmarkStart w:id="1" w:name="_Toc220681519"/>
       <w:r>
         <w:t xml:space="preserve">Valeur </w:t>
       </w:r>
@@ -1252,7 +2399,7 @@
       <w:pPr>
         <w:pStyle w:val="Titre2"/>
       </w:pPr>
-      <w:bookmarkStart w:id="2" w:name="_Toc220499870"/>
+      <w:bookmarkStart w:id="2" w:name="_Toc220681520"/>
       <w:r>
         <w:t>Valeur à définir (</w:t>
       </w:r>
@@ -1337,6 +2484,20 @@
       <w:proofErr w:type="gramEnd"/>
     </w:p>
     <w:p>
+      <w:pPr>
+        <w:pStyle w:val="Titre2"/>
+      </w:pPr>
+      <w:bookmarkStart w:id="3" w:name="_Toc220681521"/>
+    </w:p>
+    <w:p>
+      <w:pPr>
+        <w:rPr>
+          <w:rFonts w:asciiTheme="majorHAnsi" w:eastAsiaTheme="majorEastAsia" w:hAnsiTheme="majorHAnsi" w:cstheme="majorBidi"/>
+          <w:color w:val="2F5496" w:themeColor="accent1" w:themeShade="BF"/>
+          <w:sz w:val="32"/>
+          <w:szCs w:val="32"/>
+        </w:rPr>
+      </w:pPr>
       <w:r>
         <w:br w:type="page"/>
       </w:r>
@@ -1345,7 +2506,6 @@
       <w:pPr>
         <w:pStyle w:val="Titre2"/>
       </w:pPr>
-      <w:bookmarkStart w:id="3" w:name="_Toc220499871"/>
       <w:r>
         <w:lastRenderedPageBreak/>
         <w:t>Plat Roulis</w:t>
@@ -1414,7 +2574,7 @@
       <w:pPr>
         <w:pStyle w:val="Titre2"/>
       </w:pPr>
-      <w:bookmarkStart w:id="4" w:name="_Toc220499872"/>
+      <w:bookmarkStart w:id="4" w:name="_Toc220681522"/>
       <w:r>
         <w:t>Plat Tangage et Vitesse N=vitesse demandée</w:t>
       </w:r>
@@ -1497,7 +2657,7 @@
       <w:pPr>
         <w:pStyle w:val="Titre2"/>
       </w:pPr>
-      <w:bookmarkStart w:id="5" w:name="_Toc220499873"/>
+      <w:bookmarkStart w:id="5" w:name="_Toc220681523"/>
       <w:r>
         <w:t>Direction N=angle départ</w:t>
       </w:r>
@@ -1580,7 +2740,7 @@
       <w:pPr>
         <w:pStyle w:val="Titre2"/>
       </w:pPr>
-      <w:bookmarkStart w:id="6" w:name="_Toc220499874"/>
+      <w:bookmarkStart w:id="6" w:name="_Toc220681524"/>
       <w:r>
         <w:lastRenderedPageBreak/>
         <w:t>Problèmes</w:t>
@@ -1591,7 +2751,7 @@
       <w:pPr>
         <w:pStyle w:val="Titre3"/>
       </w:pPr>
-      <w:bookmarkStart w:id="7" w:name="_Toc220499875"/>
+      <w:bookmarkStart w:id="7" w:name="_Toc220681525"/>
       <w:r>
         <w:t>Problème 1 :</w:t>
       </w:r>
@@ -1621,7 +2781,7 @@
       <w:pPr>
         <w:pStyle w:val="Titre3"/>
       </w:pPr>
-      <w:bookmarkStart w:id="8" w:name="_Toc220499876"/>
+      <w:bookmarkStart w:id="8" w:name="_Toc220681526"/>
       <w:r>
         <w:t>Problème 2 :</w:t>
       </w:r>
@@ -1757,7 +2917,7 @@
         <w:lastRenderedPageBreak/>
         <w:t xml:space="preserve"> </w:t>
       </w:r>
-      <w:bookmarkStart w:id="9" w:name="_Toc220499877"/>
+      <w:bookmarkStart w:id="9" w:name="_Toc220681527"/>
       <w:r>
         <w:t xml:space="preserve">Boîte à outil commande </w:t>
       </w:r>
@@ -1775,7 +2935,7 @@
       <w:pPr>
         <w:pStyle w:val="Titre2"/>
       </w:pPr>
-      <w:bookmarkStart w:id="10" w:name="_Toc220499878"/>
+      <w:bookmarkStart w:id="10" w:name="_Toc220681528"/>
       <w:r>
         <w:t>Description et objectif :</w:t>
       </w:r>
@@ -1799,7 +2959,7 @@
       <w:pPr>
         <w:pStyle w:val="Titre2"/>
       </w:pPr>
-      <w:bookmarkStart w:id="11" w:name="_Toc220499879"/>
+      <w:bookmarkStart w:id="11" w:name="_Toc220681529"/>
       <w:r>
         <w:t>Exploration et expérimentation :</w:t>
       </w:r>
@@ -1857,7 +3017,7 @@
       <w:pPr>
         <w:pStyle w:val="Titre2"/>
       </w:pPr>
-      <w:bookmarkStart w:id="12" w:name="_Toc220499880"/>
+      <w:bookmarkStart w:id="12" w:name="_Toc220681530"/>
       <w:proofErr w:type="gramStart"/>
       <w:r>
         <w:t>Testes</w:t>
@@ -1901,9 +3061,11 @@
       <w:pPr>
         <w:pStyle w:val="Titre2"/>
       </w:pPr>
+      <w:bookmarkStart w:id="13" w:name="_Toc220681531"/>
       <w:r>
         <w:t>Fonctionnement :</w:t>
       </w:r>
+      <w:bookmarkEnd w:id="13"/>
     </w:p>
     <w:p>
       <w:pPr>
@@ -1922,9 +3084,19 @@
       </w:r>
     </w:p>
     <w:p>
+      <w:r>
+        <w:br w:type="page"/>
+      </w:r>
+    </w:p>
+    <w:p>
       <w:pPr>
         <w:jc w:val="both"/>
       </w:pPr>
+    </w:p>
+    <w:p>
+      <w:pPr>
+        <w:jc w:val="both"/>
+      </w:pPr>
       <w:r>
         <w:t xml:space="preserve">Ces commandes sont construites par le constructeur présent dans </w:t>
       </w:r>
@@ -1953,7 +3125,6 @@
         <w:rPr>
           <w:lang w:val="en-GB"/>
         </w:rPr>
-        <w:lastRenderedPageBreak/>
         <w:t xml:space="preserve">public </w:t>
       </w:r>
       <w:proofErr w:type="spellStart"/>
@@ -2309,6 +3480,12 @@
     </w:p>
     <w:p>
       <w:r>
+        <w:br w:type="page"/>
+      </w:r>
+    </w:p>
+    <w:p>
+      <w:r>
+        <w:lastRenderedPageBreak/>
         <w:t>Commande construite :</w:t>
       </w:r>
     </w:p>
@@ -2444,7 +3621,6 @@
     </w:p>
     <w:p>
       <w:r>
-        <w:lastRenderedPageBreak/>
         <w:t xml:space="preserve">        }</w:t>
       </w:r>
     </w:p>
@@ -2508,11 +3684,9 @@
       <w:r>
         <w:t xml:space="preserve"> est similaire aux ailerons, c’est un élément déterminant pour un </w:t>
       </w:r>
-      <w:proofErr w:type="gramStart"/>
-      <w:r>
-        <w:t>dérapage  ou</w:t>
-      </w:r>
-      <w:proofErr w:type="gramEnd"/>
+      <w:r>
+        <w:t>dérapage ou</w:t>
+      </w:r>
       <w:r>
         <w:t xml:space="preserve"> pour mener un virage efficacement.</w:t>
       </w:r>
@@ -2673,15 +3847,597 @@
       <w:pPr>
         <w:pStyle w:val="Titre2"/>
       </w:pPr>
-      <w:bookmarkStart w:id="13" w:name="_Toc220499881"/>
+      <w:bookmarkStart w:id="14" w:name="_Toc220681532"/>
       <w:r>
         <w:t>Correction théorique :</w:t>
       </w:r>
-      <w:bookmarkEnd w:id="13"/>
+      <w:bookmarkEnd w:id="14"/>
     </w:p>
     <w:p>
       <w:r>
         <w:t>Initialement, il était pensé de créer les commandes dans un fichier et de les référencer dans un fichier interface afin qu’elles puissent être appelées dans l’exécutable. Cette théorie était erronée, l’interface n’étant en réalité pas nécessaire bien qu’elle soit un bon élément.</w:t>
+      </w:r>
+    </w:p>
+    <w:p/>
+    <w:p>
+      <w:pPr>
+        <w:rPr>
+          <w:rFonts w:asciiTheme="majorHAnsi" w:eastAsiaTheme="majorEastAsia" w:hAnsiTheme="majorHAnsi" w:cstheme="majorBidi"/>
+          <w:color w:val="2F5496" w:themeColor="accent1" w:themeShade="BF"/>
+          <w:sz w:val="40"/>
+          <w:szCs w:val="40"/>
+        </w:rPr>
+      </w:pPr>
+      <w:r>
+        <w:br w:type="page"/>
+      </w:r>
+    </w:p>
+    <w:p>
+      <w:pPr>
+        <w:pStyle w:val="Titre1"/>
+      </w:pPr>
+      <w:bookmarkStart w:id="15" w:name="_Toc220681533"/>
+      <w:r>
+        <w:lastRenderedPageBreak/>
+        <w:t>Ajout d’un mode de vol en cercle complet</w:t>
+      </w:r>
+      <w:bookmarkEnd w:id="15"/>
+    </w:p>
+    <w:p>
+      <w:pPr>
+        <w:pStyle w:val="Titre2"/>
+      </w:pPr>
+      <w:bookmarkStart w:id="16" w:name="_Toc220681534"/>
+      <w:r>
+        <w:t>Objectif général</w:t>
+      </w:r>
+      <w:bookmarkEnd w:id="16"/>
+    </w:p>
+    <w:p>
+      <w:r>
+        <w:t>L’objectif est de permettre à l’avion de réaliser un cercle complet automatique vers la gauche, tout en conservant la logique de base du vol plat existant. Le cercle est déclenché manuellement et se termine automatiquement lorsque l’avion revient à sa direction de départ.</w:t>
+      </w:r>
+    </w:p>
+    <w:p/>
+    <w:p>
+      <w:pPr>
+        <w:pStyle w:val="Titre2"/>
+      </w:pPr>
+      <w:bookmarkStart w:id="17" w:name="_Toc220681535"/>
+      <w:r>
+        <w:t>Valeurs récupérées (</w:t>
+      </w:r>
+      <w:proofErr w:type="spellStart"/>
+      <w:r>
+        <w:t>Get</w:t>
+      </w:r>
+      <w:proofErr w:type="spellEnd"/>
+      <w:r>
+        <w:t>)</w:t>
+      </w:r>
+      <w:bookmarkEnd w:id="17"/>
+    </w:p>
+    <w:p>
+      <w:r>
+        <w:t>• Boussole : MAGNETIC COMPASS Permet de connaître le cap actuel de l’avion</w:t>
+      </w:r>
+    </w:p>
+    <w:p>
+      <w:r>
+        <w:t>• Angle de roulis : PLANE BANK DEGREES Utilisé pour vérifier l’inclinaison de l’avion pendant le virage</w:t>
+      </w:r>
+    </w:p>
+    <w:p>
+      <w:r>
+        <w:t>• Vitesse : AIRSPEED INDICATED Influence indirectement le rayon du cercle</w:t>
+      </w:r>
+    </w:p>
+    <w:p>
+      <w:pPr>
+        <w:pStyle w:val="Titre2"/>
+      </w:pPr>
+    </w:p>
+    <w:p>
+      <w:pPr>
+        <w:pStyle w:val="Titre2"/>
+      </w:pPr>
+      <w:bookmarkStart w:id="18" w:name="_Toc220681536"/>
+      <w:r>
+        <w:t>Valeur définie (Set)</w:t>
+      </w:r>
+      <w:bookmarkEnd w:id="18"/>
+    </w:p>
+    <w:p>
+      <w:r>
+        <w:t xml:space="preserve">• Ailerons : AILERON POSITION Utilisés pour incliner l’avion vers la gauche </w:t>
+      </w:r>
+    </w:p>
+    <w:p>
+      <w:r>
+        <w:t>• Dérive : RUDDER POSITION Utilisé pour maintenir un virage stable</w:t>
+      </w:r>
+    </w:p>
+    <w:p>
+      <w:r>
+        <w:t xml:space="preserve">• </w:t>
+      </w:r>
+      <w:r>
+        <w:t>Profondeur</w:t>
+      </w:r>
+      <w:r>
+        <w:t xml:space="preserve"> :</w:t>
+      </w:r>
+      <w:r>
+        <w:t xml:space="preserve"> </w:t>
+      </w:r>
+      <w:r>
+        <w:t xml:space="preserve"> </w:t>
+      </w:r>
+      <w:r>
+        <w:t>ELEVATOR POSITION</w:t>
+      </w:r>
+      <w:r>
+        <w:t xml:space="preserve"> Utilisés pour faire le virage correctement</w:t>
+      </w:r>
+    </w:p>
+    <w:p/>
+    <w:p>
+      <w:pPr>
+        <w:pStyle w:val="Titre2"/>
+      </w:pPr>
+      <w:bookmarkStart w:id="19" w:name="_Toc220681537"/>
+      <w:r>
+        <w:t>Déclenchement du cercle</w:t>
+      </w:r>
+      <w:bookmarkEnd w:id="19"/>
+    </w:p>
+    <w:p>
+      <w:r>
+        <w:t xml:space="preserve">Le cercle est déclenché par l’utilisateur à l’aide du clavier : </w:t>
+      </w:r>
+    </w:p>
+    <w:p>
+      <w:r>
+        <w:t>• Appui sur la touche C</w:t>
+      </w:r>
+    </w:p>
+    <w:p>
+      <w:r>
+        <w:t xml:space="preserve">• Activation d’une variable d’état </w:t>
+      </w:r>
+      <w:proofErr w:type="spellStart"/>
+      <w:r>
+        <w:t>doCircle</w:t>
+      </w:r>
+      <w:proofErr w:type="spellEnd"/>
+      <w:r>
+        <w:t xml:space="preserve"> Tant que cette variable est active, le mode vol en ligne droite est désactivé</w:t>
+      </w:r>
+      <w:r>
+        <w:t>.</w:t>
+      </w:r>
+    </w:p>
+    <w:p>
+      <w:bookmarkStart w:id="20" w:name="_Toc220681538"/>
+      <w:r>
+        <w:rPr>
+          <w:rStyle w:val="Titre2Car"/>
+        </w:rPr>
+        <w:t>Mémorisation du cap de départ</w:t>
+      </w:r>
+      <w:bookmarkEnd w:id="20"/>
+      <w:r>
+        <w:t xml:space="preserve"> </w:t>
+      </w:r>
+    </w:p>
+    <w:p>
+      <w:r>
+        <w:t xml:space="preserve">Au début du cercle, le cap est stocké dans une variable </w:t>
+      </w:r>
+      <w:proofErr w:type="spellStart"/>
+      <w:r>
+        <w:t>circleStartHeading</w:t>
+      </w:r>
+      <w:proofErr w:type="spellEnd"/>
+      <w:r>
+        <w:t xml:space="preserve">, et une variable </w:t>
+      </w:r>
+      <w:proofErr w:type="spellStart"/>
+      <w:r>
+        <w:t>leftStartHeading</w:t>
+      </w:r>
+      <w:proofErr w:type="spellEnd"/>
+      <w:r>
+        <w:t xml:space="preserve"> est initialisée à false. Ces variables permettent de savoir quand l’avion a quitté le cap de départ, et quand il y est revenu après un tour complet.</w:t>
+      </w:r>
+    </w:p>
+    <w:p>
+      <w:r>
+        <w:br w:type="page"/>
+      </w:r>
+    </w:p>
+    <w:p>
+      <w:pPr>
+        <w:rPr>
+          <w:rStyle w:val="Titre2Car"/>
+        </w:rPr>
+      </w:pPr>
+      <w:bookmarkStart w:id="21" w:name="_Toc220681539"/>
+      <w:r>
+        <w:rPr>
+          <w:rStyle w:val="Titre2Car"/>
+        </w:rPr>
+        <w:lastRenderedPageBreak/>
+        <w:t>Logique du virage</w:t>
+      </w:r>
+      <w:bookmarkEnd w:id="21"/>
+    </w:p>
+    <w:p>
+      <w:r>
+        <w:rPr>
+          <w:rStyle w:val="Titre2Car"/>
+        </w:rPr>
+        <w:t xml:space="preserve"> </w:t>
+      </w:r>
+      <w:r>
+        <w:t xml:space="preserve">Pendant le cercle : </w:t>
+      </w:r>
+    </w:p>
+    <w:p>
+      <w:r>
+        <w:t>• Les ailerons sont fixés à une valeur constante vers la gauche</w:t>
+      </w:r>
+    </w:p>
+    <w:p>
+      <w:r>
+        <w:t xml:space="preserve">• La dérive est également appliquée vers la gauche </w:t>
+      </w:r>
+    </w:p>
+    <w:p>
+      <w:r>
+        <w:t xml:space="preserve">• La </w:t>
+      </w:r>
+      <w:r>
+        <w:t xml:space="preserve">profondeur </w:t>
+      </w:r>
+      <w:r>
+        <w:t>est également appliquée vers l</w:t>
+      </w:r>
+      <w:r>
+        <w:t>e haut</w:t>
+      </w:r>
+    </w:p>
+    <w:p/>
+    <w:p>
+      <w:r>
+        <w:t>Cela permet d’obtenir :</w:t>
+      </w:r>
+    </w:p>
+    <w:p>
+      <w:r>
+        <w:t xml:space="preserve">• Un virage fluide </w:t>
+      </w:r>
+    </w:p>
+    <w:p>
+      <w:r>
+        <w:t xml:space="preserve">• Un cercle continu </w:t>
+      </w:r>
+    </w:p>
+    <w:p>
+      <w:r>
+        <w:t>Le rayon du virage dépend de :</w:t>
+      </w:r>
+    </w:p>
+    <w:p>
+      <w:r>
+        <w:t>• La vitesse de l’avion</w:t>
+      </w:r>
+    </w:p>
+    <w:p>
+      <w:r>
+        <w:t xml:space="preserve">• L’angle appliqué aux commandes </w:t>
+      </w:r>
+    </w:p>
+    <w:p/>
+    <w:p>
+      <w:bookmarkStart w:id="22" w:name="_Toc220681540"/>
+      <w:r>
+        <w:rPr>
+          <w:rStyle w:val="Titre2Car"/>
+        </w:rPr>
+        <w:t>Détection du cercle complet</w:t>
+      </w:r>
+      <w:bookmarkEnd w:id="22"/>
+      <w:r>
+        <w:t xml:space="preserve"> </w:t>
+      </w:r>
+    </w:p>
+    <w:p>
+      <w:pPr>
+        <w:rPr>
+          <w:rStyle w:val="Titre3Car"/>
+        </w:rPr>
+      </w:pPr>
+      <w:bookmarkStart w:id="23" w:name="_Toc220681541"/>
+      <w:r>
+        <w:rPr>
+          <w:rStyle w:val="Titre3Car"/>
+        </w:rPr>
+        <w:t>Problème des angles 0 / 360</w:t>
+      </w:r>
+      <w:bookmarkEnd w:id="23"/>
+    </w:p>
+    <w:p>
+      <w:r>
+        <w:t>Les angles de cap étant compris entre 0 et 360, une comparaison directe peut provoquer des erreurs lors du passage par 0.</w:t>
+      </w:r>
+    </w:p>
+    <w:p>
+      <w:pPr>
+        <w:rPr>
+          <w:b/>
+          <w:bCs/>
+        </w:rPr>
+      </w:pPr>
+      <w:r>
+        <w:rPr>
+          <w:b/>
+          <w:bCs/>
+        </w:rPr>
+        <w:t xml:space="preserve">Exemple : </w:t>
+      </w:r>
+    </w:p>
+    <w:p>
+      <w:r>
+        <w:t xml:space="preserve">Cap de départ : 350 </w:t>
+      </w:r>
+    </w:p>
+    <w:p>
+      <w:r>
+        <w:t xml:space="preserve">Cap actuel : 10 </w:t>
+      </w:r>
+    </w:p>
+    <w:p>
+      <w:r>
+        <w:t>10 – 350 = -340 On obtient une valeur très grande, alors qu’en réalité l’avion ne s’est écarté que de 20 degrés. Ce type de de calcul fausse la détection du retour au cap de départ et de la fin du cercle</w:t>
+      </w:r>
+      <w:r>
+        <w:t>.</w:t>
+      </w:r>
+    </w:p>
+    <w:p>
+      <w:bookmarkStart w:id="24" w:name="_Toc220681542"/>
+      <w:r>
+        <w:rPr>
+          <w:rStyle w:val="Titre2Car"/>
+        </w:rPr>
+        <w:t>Solution : Normalisation des angles</w:t>
+      </w:r>
+      <w:bookmarkEnd w:id="24"/>
+      <w:r>
+        <w:t xml:space="preserve"> </w:t>
+      </w:r>
+    </w:p>
+    <w:p>
+      <w:r>
+        <w:t xml:space="preserve">La fonction </w:t>
+      </w:r>
+      <w:proofErr w:type="spellStart"/>
+      <w:r>
+        <w:rPr>
+          <w:b/>
+          <w:bCs/>
+        </w:rPr>
+        <w:t>NormalizeAngle</w:t>
+      </w:r>
+      <w:proofErr w:type="spellEnd"/>
+      <w:r>
+        <w:t xml:space="preserve"> est utilisée pour ramener toute différence de cap dans l’intervalle -180, 180</w:t>
+      </w:r>
+    </w:p>
+    <w:p>
+      <w:r>
+        <w:t>Cela permet une comparaison fiable du cap, quelle que soit la position de l’avion.</w:t>
+      </w:r>
+    </w:p>
+    <w:p>
+      <w:r>
+        <w:br w:type="page"/>
+      </w:r>
+    </w:p>
+    <w:p>
+      <w:pPr>
+        <w:pStyle w:val="Titre2"/>
+      </w:pPr>
+      <w:bookmarkStart w:id="25" w:name="_Toc220681543"/>
+      <w:r>
+        <w:lastRenderedPageBreak/>
+        <w:t>Conditions de fin du cercle</w:t>
+      </w:r>
+      <w:bookmarkEnd w:id="25"/>
+    </w:p>
+    <w:p>
+      <w:r>
+        <w:t xml:space="preserve">Le cercle est considéré comme terminé lorsque : </w:t>
+      </w:r>
+    </w:p>
+    <w:p>
+      <w:r>
+        <w:t xml:space="preserve">• L’avion s’est éloigné du cap de départ de plus de </w:t>
+      </w:r>
+      <w:r>
+        <w:t>8</w:t>
+      </w:r>
+      <w:r>
+        <w:t>0°</w:t>
+      </w:r>
+    </w:p>
+    <w:p>
+      <w:r>
+        <w:t xml:space="preserve">• L’avion revient à moins de </w:t>
+      </w:r>
+      <w:r>
+        <w:t>80</w:t>
+      </w:r>
+      <w:r>
+        <w:t xml:space="preserve"> ° de ce même cap </w:t>
+      </w:r>
+    </w:p>
+    <w:p>
+      <w:r>
+        <w:t>Ces deux conditions évitent un arrêt immédiat du cercle au moment du déclenchement.</w:t>
+      </w:r>
+    </w:p>
+    <w:p/>
+    <w:p>
+      <w:pPr>
+        <w:pStyle w:val="Titre2"/>
+      </w:pPr>
+      <w:bookmarkStart w:id="26" w:name="_Toc220681544"/>
+      <w:r>
+        <w:t>Fin du cercle</w:t>
+      </w:r>
+      <w:bookmarkEnd w:id="26"/>
+    </w:p>
+    <w:p>
+      <w:r>
+        <w:t xml:space="preserve"> Lorsque le cercle est terminé : </w:t>
+      </w:r>
+    </w:p>
+    <w:p>
+      <w:r>
+        <w:t>• Les ailerons et la dérive sont remis à 0</w:t>
+      </w:r>
+    </w:p>
+    <w:p>
+      <w:r>
+        <w:t xml:space="preserve">• La variable </w:t>
+      </w:r>
+      <w:proofErr w:type="spellStart"/>
+      <w:r>
+        <w:rPr>
+          <w:b/>
+          <w:bCs/>
+        </w:rPr>
+        <w:t>doCircle</w:t>
+      </w:r>
+      <w:proofErr w:type="spellEnd"/>
+      <w:r>
+        <w:t xml:space="preserve"> est désactivée </w:t>
+      </w:r>
+    </w:p>
+    <w:p>
+      <w:r>
+        <w:t>• Les variables du cercle sont réinitialisées</w:t>
+      </w:r>
+    </w:p>
+    <w:p>
+      <w:r>
+        <w:t>• L’avion repasse automatiquement en vol en ligne droite</w:t>
+      </w:r>
+    </w:p>
+    <w:p/>
+    <w:p>
+      <w:pPr>
+        <w:pStyle w:val="Titre2"/>
+      </w:pPr>
+      <w:bookmarkStart w:id="27" w:name="_Toc220681545"/>
+      <w:r>
+        <w:t>Avantages de cette approche</w:t>
+      </w:r>
+      <w:bookmarkEnd w:id="27"/>
+    </w:p>
+    <w:p>
+      <w:r>
+        <w:t>• Le cercle est basé sur la direction, pas sur le temps</w:t>
+      </w:r>
+    </w:p>
+    <w:p>
+      <w:r>
+        <w:t>• La logique est robuste face aux variations de vitesse</w:t>
+      </w:r>
+    </w:p>
+    <w:p>
+      <w:r>
+        <w:t>• Aucun conflit avec le vol plat existant</w:t>
+      </w:r>
+    </w:p>
+    <w:p>
+      <w:r>
+        <w:t xml:space="preserve">• Le système est facilement extensible : </w:t>
+      </w:r>
+    </w:p>
+    <w:p>
+      <w:pPr>
+        <w:ind w:firstLine="708"/>
+      </w:pPr>
+      <w:proofErr w:type="gramStart"/>
+      <w:r>
+        <w:t>o</w:t>
+      </w:r>
+      <w:proofErr w:type="gramEnd"/>
+      <w:r>
+        <w:t xml:space="preserve"> Cercle à droite</w:t>
+      </w:r>
+    </w:p>
+    <w:p>
+      <w:pPr>
+        <w:ind w:firstLine="708"/>
+      </w:pPr>
+      <w:proofErr w:type="gramStart"/>
+      <w:r>
+        <w:t>o</w:t>
+      </w:r>
+      <w:proofErr w:type="gramEnd"/>
+      <w:r>
+        <w:t xml:space="preserve"> Enchaînement de manœuvres</w:t>
+      </w:r>
+    </w:p>
+    <w:p/>
+    <w:p>
+      <w:pPr>
+        <w:pStyle w:val="Titre3"/>
+      </w:pPr>
+      <w:bookmarkStart w:id="28" w:name="_Toc220681546"/>
+      <w:r>
+        <w:t>Limites et améliorations possibles</w:t>
+      </w:r>
+      <w:bookmarkEnd w:id="28"/>
+    </w:p>
+    <w:p>
+      <w:r>
+        <w:t>• Le rayon du cercle n’est pas constant</w:t>
+      </w:r>
+    </w:p>
+    <w:p>
+      <w:r>
+        <w:t>• L’altitude peut légèrement varier</w:t>
+      </w:r>
+    </w:p>
+    <w:p>
+      <w:r>
+        <w:t>• Une gestion plus fine du roulis pourrait améliorer la stabilité</w:t>
+      </w:r>
+    </w:p>
+    <w:p>
+      <w:r>
+        <w:t>• Possibilité d’ajouter une correction progressive via le roulis</w:t>
+      </w:r>
+    </w:p>
+    <w:p>
+      <w:pPr>
+        <w:pStyle w:val="Titre2"/>
+      </w:pPr>
+      <w:bookmarkStart w:id="29" w:name="_Toc220681547"/>
+      <w:r>
+        <w:lastRenderedPageBreak/>
+        <w:t>Conclusion</w:t>
+      </w:r>
+      <w:bookmarkEnd w:id="29"/>
+    </w:p>
+    <w:p>
+      <w:r>
+        <w:t>Cette implémentation permet de réaliser un cercle complet de manière fiable et contrôlée, tout en conservant le fonctionnement du vol en ligne droite. La séparation des modes de vol évite les conflits et facilite la maintenance du code.</w:t>
       </w:r>
     </w:p>
     <w:sectPr>
@@ -3689,7 +5445,7 @@
   <w:abstractNum w:abstractNumId="6" w15:restartNumberingAfterBreak="0">
     <w:nsid w:val="5A801EF3"/>
     <w:multiLevelType w:val="multilevel"/>
-    <w:tmpl w:val="18CC95B8"/>
+    <w:tmpl w:val="F5FC866E"/>
     <w:lvl w:ilvl="0">
       <w:start w:val="1"/>
       <w:numFmt w:val="bullet"/>
@@ -3706,20 +5462,15 @@
         <w:sz w:val="20"/>
       </w:rPr>
     </w:lvl>
-    <w:lvl w:ilvl="1" w:tentative="1">
-      <w:start w:val="1"/>
-      <w:numFmt w:val="bullet"/>
-      <w:lvlText w:val="o"/>
-      <w:lvlJc w:val="left"/>
-      <w:pPr>
-        <w:tabs>
-          <w:tab w:val="num" w:pos="1440"/>
-        </w:tabs>
+    <w:lvl w:ilvl="1">
+      <w:numFmt w:val="bullet"/>
+      <w:lvlText w:val="-"/>
+      <w:lvlJc w:val="left"/>
+      <w:pPr>
         <w:ind w:left="1440" w:hanging="360"/>
       </w:pPr>
       <w:rPr>
-        <w:rFonts w:ascii="Courier New" w:hAnsi="Courier New" w:hint="default"/>
-        <w:sz w:val="20"/>
+        <w:rFonts w:ascii="Calibri" w:eastAsiaTheme="minorHAnsi" w:hAnsi="Calibri" w:cs="Calibri" w:hint="default"/>
       </w:rPr>
     </w:lvl>
     <w:lvl w:ilvl="2" w:tentative="1">

</xml_diff>